<commit_message>
handling three subtleties of exception
</commit_message>
<xml_diff>
--- a/CSAPP/Vocabulary of CSAPP.docx
+++ b/CSAPP/Vocabulary of CSAPP.docx
@@ -1,6 +1,6 @@
 
 <file path=word/document.xml><?xml version="1.0" encoding="utf-8"?>
-<w:document xmlns:wpc="http://schemas.microsoft.com/office/word/2010/wordprocessingCanvas" xmlns:mc="http://schemas.openxmlformats.org/markup-compatibility/2006" xmlns:o="urn:schemas-microsoft-com:office:office" xmlns:r="http://schemas.openxmlformats.org/officeDocument/2006/relationships" xmlns:m="http://schemas.openxmlformats.org/officeDocument/2006/math" xmlns:v="urn:schemas-microsoft-com:vml" xmlns:wp14="http://schemas.microsoft.com/office/word/2010/wordprocessingDrawing" xmlns:wp="http://schemas.openxmlformats.org/drawingml/2006/wordprocessingDrawing" xmlns:w10="urn:schemas-microsoft-com:office:word" xmlns:w="http://schemas.openxmlformats.org/wordprocessingml/2006/main" xmlns:w14="http://schemas.microsoft.com/office/word/2010/wordml" xmlns:wpg="http://schemas.microsoft.com/office/word/2010/wordprocessingGroup" xmlns:wpi="http://schemas.microsoft.com/office/word/2010/wordprocessingInk" xmlns:wne="http://schemas.microsoft.com/office/word/2006/wordml" xmlns:wps="http://schemas.microsoft.com/office/word/2010/wordprocessingShape" mc:Ignorable="w14 wp14">
+<w:document xmlns:wpc="http://schemas.microsoft.com/office/word/2010/wordprocessingCanvas" xmlns:cx="http://schemas.microsoft.com/office/drawing/2014/chartex" xmlns:cx1="http://schemas.microsoft.com/office/drawing/2015/9/8/chartex" xmlns:cx2="http://schemas.microsoft.com/office/drawing/2015/10/21/chartex" xmlns:cx3="http://schemas.microsoft.com/office/drawing/2016/5/9/chartex" xmlns:cx4="http://schemas.microsoft.com/office/drawing/2016/5/10/chartex" xmlns:cx5="http://schemas.microsoft.com/office/drawing/2016/5/11/chartex" xmlns:cx6="http://schemas.microsoft.com/office/drawing/2016/5/12/chartex" xmlns:cx7="http://schemas.microsoft.com/office/drawing/2016/5/13/chartex" xmlns:cx8="http://schemas.microsoft.com/office/drawing/2016/5/14/chartex" xmlns:mc="http://schemas.openxmlformats.org/markup-compatibility/2006" xmlns:aink="http://schemas.microsoft.com/office/drawing/2016/ink" xmlns:am3d="http://schemas.microsoft.com/office/drawing/2017/model3d" xmlns:o="urn:schemas-microsoft-com:office:office" xmlns:oel="http://schemas.microsoft.com/office/2019/extlst" xmlns:r="http://schemas.openxmlformats.org/officeDocument/2006/relationships" xmlns:m="http://schemas.openxmlformats.org/officeDocument/2006/math" xmlns:v="urn:schemas-microsoft-com:vml" xmlns:wp14="http://schemas.microsoft.com/office/word/2010/wordprocessingDrawing" xmlns:wp="http://schemas.openxmlformats.org/drawingml/2006/wordprocessingDrawing" xmlns:w10="urn:schemas-microsoft-com:office:word" xmlns:w="http://schemas.openxmlformats.org/wordprocessingml/2006/main" xmlns:w14="http://schemas.microsoft.com/office/word/2010/wordml" xmlns:w15="http://schemas.microsoft.com/office/word/2012/wordml" xmlns:w16cex="http://schemas.microsoft.com/office/word/2018/wordml/cex" xmlns:w16cid="http://schemas.microsoft.com/office/word/2016/wordml/cid" xmlns:w16="http://schemas.microsoft.com/office/word/2018/wordml" xmlns:w16du="http://schemas.microsoft.com/office/word/2023/wordml/word16du" xmlns:w16sdtdh="http://schemas.microsoft.com/office/word/2020/wordml/sdtdatahash" xmlns:w16sdtfl="http://schemas.microsoft.com/office/word/2024/wordml/sdtformatlock" xmlns:w16se="http://schemas.microsoft.com/office/word/2015/wordml/symex" xmlns:wpg="http://schemas.microsoft.com/office/word/2010/wordprocessingGroup" xmlns:wpi="http://schemas.microsoft.com/office/word/2010/wordprocessingInk" xmlns:wne="http://schemas.microsoft.com/office/word/2006/wordml" xmlns:wps="http://schemas.microsoft.com/office/word/2010/wordprocessingShape" mc:Ignorable="w14 w15 w16se w16cid w16 w16cex w16sdtdh w16sdtfl w16du wp14">
   <w:body>
     <w:p>
       <w:pPr>
@@ -21,6 +21,7 @@
           <w:szCs w:val="24"/>
         </w:rPr>
       </w:pPr>
+      <w:proofErr w:type="spellStart"/>
       <w:r>
         <w:rPr>
           <w:rFonts w:ascii="Arial" w:hAnsi="Arial" w:cs="Arial"/>
@@ -31,6 +32,7 @@
         </w:rPr>
         <w:t>hierachical</w:t>
       </w:r>
+      <w:proofErr w:type="spellEnd"/>
       <w:r>
         <w:rPr>
           <w:rFonts w:ascii="Arial" w:hAnsi="Arial" w:cs="Arial"/>
@@ -199,13 +201,41 @@
         </w:rPr>
         <w:t>;</w:t>
       </w:r>
-      <w:r>
-        <w:rPr>
-          <w:rFonts w:ascii="Arial" w:hAnsi="Arial" w:cs="Arial"/>
-          <w:sz w:val="24"/>
-          <w:szCs w:val="24"/>
-        </w:rPr>
-        <w:t xml:space="preserve">arraged in hierachy </w:t>
+      <w:proofErr w:type="spellStart"/>
+      <w:r>
+        <w:rPr>
+          <w:rFonts w:ascii="Arial" w:hAnsi="Arial" w:cs="Arial"/>
+          <w:sz w:val="24"/>
+          <w:szCs w:val="24"/>
+        </w:rPr>
+        <w:t>arraged</w:t>
+      </w:r>
+      <w:proofErr w:type="spellEnd"/>
+      <w:r>
+        <w:rPr>
+          <w:rFonts w:ascii="Arial" w:hAnsi="Arial" w:cs="Arial"/>
+          <w:sz w:val="24"/>
+          <w:szCs w:val="24"/>
+        </w:rPr>
+        <w:t xml:space="preserve"> in </w:t>
+      </w:r>
+      <w:proofErr w:type="spellStart"/>
+      <w:r>
+        <w:rPr>
+          <w:rFonts w:ascii="Arial" w:hAnsi="Arial" w:cs="Arial"/>
+          <w:sz w:val="24"/>
+          <w:szCs w:val="24"/>
+        </w:rPr>
+        <w:t>hierachy</w:t>
+      </w:r>
+      <w:proofErr w:type="spellEnd"/>
+      <w:r>
+        <w:rPr>
+          <w:rFonts w:ascii="Arial" w:hAnsi="Arial" w:cs="Arial"/>
+          <w:sz w:val="24"/>
+          <w:szCs w:val="24"/>
+        </w:rPr>
+        <w:t xml:space="preserve"> </w:t>
       </w:r>
     </w:p>
     <w:p>
@@ -433,7 +463,25 @@
           <w:sz w:val="24"/>
           <w:szCs w:val="24"/>
         </w:rPr>
-        <w:t>The significand[1] (also coefficient,[1] sometimes argument, or more ambiguously mantissa,[2] fraction,[3][4][nb 1] or characteristic[5][2]) is the first (left) part of a number in scientific notation or related concepts in floating-point representation</w:t>
+        <w:t>The significand[1] (also coefficient,[1] sometimes argument, or more ambiguously mantissa,[2] fraction,[3][4][</w:t>
+      </w:r>
+      <w:proofErr w:type="spellStart"/>
+      <w:r>
+        <w:rPr>
+          <w:rFonts w:ascii="Times New Roman" w:hAnsi="Times New Roman" w:cs="Times New Roman"/>
+          <w:sz w:val="24"/>
+          <w:szCs w:val="24"/>
+        </w:rPr>
+        <w:t>nb</w:t>
+      </w:r>
+      <w:proofErr w:type="spellEnd"/>
+      <w:r>
+        <w:rPr>
+          <w:rFonts w:ascii="Times New Roman" w:hAnsi="Times New Roman" w:cs="Times New Roman"/>
+          <w:sz w:val="24"/>
+          <w:szCs w:val="24"/>
+        </w:rPr>
+        <w:t xml:space="preserve"> 1] or characteristic[5][2]) is the first (left) part of a number in scientific notation or related concepts in floating-point representation</w:t>
       </w:r>
       <w:r>
         <w:rPr>
@@ -848,14 +896,32 @@
           <w:sz w:val="22"/>
           <w:szCs w:val="24"/>
         </w:rPr>
-        <w:t xml:space="preserve">[n.C.] </w:t>
-      </w:r>
+        <w:t>[</w:t>
+      </w:r>
+      <w:proofErr w:type="spellStart"/>
       <w:r>
         <w:rPr>
           <w:rFonts w:ascii="Arial" w:hAnsi="Arial" w:cs="Arial" w:hint="eastAsia"/>
           <w:sz w:val="22"/>
           <w:szCs w:val="24"/>
         </w:rPr>
+        <w:t>n.C.</w:t>
+      </w:r>
+      <w:proofErr w:type="spellEnd"/>
+      <w:r>
+        <w:rPr>
+          <w:rFonts w:ascii="Arial" w:hAnsi="Arial" w:cs="Arial" w:hint="eastAsia"/>
+          <w:sz w:val="22"/>
+          <w:szCs w:val="24"/>
+        </w:rPr>
+        <w:t xml:space="preserve">] </w:t>
+      </w:r>
+      <w:r>
+        <w:rPr>
+          <w:rFonts w:ascii="Arial" w:hAnsi="Arial" w:cs="Arial" w:hint="eastAsia"/>
+          <w:sz w:val="22"/>
+          <w:szCs w:val="24"/>
+        </w:rPr>
         <w:t>移位</w:t>
       </w:r>
     </w:p>
@@ -1021,7 +1087,43 @@
           <w:sz w:val="24"/>
           <w:szCs w:val="24"/>
         </w:rPr>
-        <w:t>[vt.] to go or travel around sth that is blocking your way.</w:t>
+        <w:t>[</w:t>
+      </w:r>
+      <w:proofErr w:type="spellStart"/>
+      <w:r>
+        <w:rPr>
+          <w:rFonts w:ascii="Times New Roman" w:hAnsi="Times New Roman" w:cs="Times New Roman" w:hint="eastAsia"/>
+          <w:sz w:val="24"/>
+          <w:szCs w:val="24"/>
+        </w:rPr>
+        <w:t>vt.</w:t>
+      </w:r>
+      <w:proofErr w:type="spellEnd"/>
+      <w:r>
+        <w:rPr>
+          <w:rFonts w:ascii="Times New Roman" w:hAnsi="Times New Roman" w:cs="Times New Roman" w:hint="eastAsia"/>
+          <w:sz w:val="24"/>
+          <w:szCs w:val="24"/>
+        </w:rPr>
+        <w:t xml:space="preserve">] to go or travel around </w:t>
+      </w:r>
+      <w:proofErr w:type="spellStart"/>
+      <w:r>
+        <w:rPr>
+          <w:rFonts w:ascii="Times New Roman" w:hAnsi="Times New Roman" w:cs="Times New Roman" w:hint="eastAsia"/>
+          <w:sz w:val="24"/>
+          <w:szCs w:val="24"/>
+        </w:rPr>
+        <w:t>sth</w:t>
+      </w:r>
+      <w:proofErr w:type="spellEnd"/>
+      <w:r>
+        <w:rPr>
+          <w:rFonts w:ascii="Times New Roman" w:hAnsi="Times New Roman" w:cs="Times New Roman" w:hint="eastAsia"/>
+          <w:sz w:val="24"/>
+          <w:szCs w:val="24"/>
+        </w:rPr>
+        <w:t xml:space="preserve"> that is blocking your way.</w:t>
       </w:r>
       <w:r>
         <w:rPr>
@@ -1195,7 +1297,61 @@
           <w:sz w:val="22"/>
           <w:szCs w:val="20"/>
         </w:rPr>
-        <w:t>[vt.] to be encough for sb/sth.</w:t>
+        <w:t>[</w:t>
+      </w:r>
+      <w:proofErr w:type="spellStart"/>
+      <w:r>
+        <w:rPr>
+          <w:rFonts w:ascii="Times New Roman" w:hAnsi="Times New Roman" w:cs="Times New Roman" w:hint="eastAsia"/>
+          <w:sz w:val="22"/>
+          <w:szCs w:val="20"/>
+        </w:rPr>
+        <w:t>vt.</w:t>
+      </w:r>
+      <w:proofErr w:type="spellEnd"/>
+      <w:r>
+        <w:rPr>
+          <w:rFonts w:ascii="Times New Roman" w:hAnsi="Times New Roman" w:cs="Times New Roman" w:hint="eastAsia"/>
+          <w:sz w:val="22"/>
+          <w:szCs w:val="20"/>
+        </w:rPr>
+        <w:t xml:space="preserve">] to be </w:t>
+      </w:r>
+      <w:proofErr w:type="spellStart"/>
+      <w:r>
+        <w:rPr>
+          <w:rFonts w:ascii="Times New Roman" w:hAnsi="Times New Roman" w:cs="Times New Roman" w:hint="eastAsia"/>
+          <w:sz w:val="22"/>
+          <w:szCs w:val="20"/>
+        </w:rPr>
+        <w:t>encough</w:t>
+      </w:r>
+      <w:proofErr w:type="spellEnd"/>
+      <w:r>
+        <w:rPr>
+          <w:rFonts w:ascii="Times New Roman" w:hAnsi="Times New Roman" w:cs="Times New Roman" w:hint="eastAsia"/>
+          <w:sz w:val="22"/>
+          <w:szCs w:val="20"/>
+        </w:rPr>
+        <w:t xml:space="preserve"> for sb/</w:t>
+      </w:r>
+      <w:proofErr w:type="spellStart"/>
+      <w:r>
+        <w:rPr>
+          <w:rFonts w:ascii="Times New Roman" w:hAnsi="Times New Roman" w:cs="Times New Roman" w:hint="eastAsia"/>
+          <w:sz w:val="22"/>
+          <w:szCs w:val="20"/>
+        </w:rPr>
+        <w:t>sth</w:t>
+      </w:r>
+      <w:proofErr w:type="spellEnd"/>
+      <w:r>
+        <w:rPr>
+          <w:rFonts w:ascii="Times New Roman" w:hAnsi="Times New Roman" w:cs="Times New Roman" w:hint="eastAsia"/>
+          <w:sz w:val="22"/>
+          <w:szCs w:val="20"/>
+        </w:rPr>
+        <w:t>.</w:t>
       </w:r>
     </w:p>
     <w:p>
@@ -1336,7 +1492,25 @@
           <w:sz w:val="22"/>
           <w:szCs w:val="20"/>
         </w:rPr>
-        <w:t>[adj.] next to or near sth.</w:t>
+        <w:t xml:space="preserve">[adj.] next to or near </w:t>
+      </w:r>
+      <w:proofErr w:type="spellStart"/>
+      <w:r>
+        <w:rPr>
+          <w:rFonts w:ascii="Times New Roman" w:hAnsi="Times New Roman" w:cs="Times New Roman" w:hint="eastAsia"/>
+          <w:sz w:val="22"/>
+          <w:szCs w:val="20"/>
+        </w:rPr>
+        <w:t>sth</w:t>
+      </w:r>
+      <w:proofErr w:type="spellEnd"/>
+      <w:r>
+        <w:rPr>
+          <w:rFonts w:ascii="Times New Roman" w:hAnsi="Times New Roman" w:cs="Times New Roman" w:hint="eastAsia"/>
+          <w:sz w:val="22"/>
+          <w:szCs w:val="20"/>
+        </w:rPr>
+        <w:t>.</w:t>
       </w:r>
     </w:p>
     <w:p>
@@ -1365,84 +1539,222 @@
           <w:sz w:val="22"/>
           <w:szCs w:val="20"/>
         </w:rPr>
+        <w:t>obscure</w:t>
+      </w:r>
+      <w:r>
+        <w:rPr>
+          <w:rFonts w:ascii="Times New Roman" w:hAnsi="Times New Roman" w:cs="Times New Roman" w:hint="eastAsia"/>
+          <w:sz w:val="22"/>
+          <w:szCs w:val="20"/>
+        </w:rPr>
+        <w:t xml:space="preserve"> /</w:t>
+      </w:r>
+      <w:r>
+        <w:rPr>
+          <w:rFonts w:ascii="GWIPA" w:hAnsi="GWIPA" w:cs="Times New Roman"/>
+          <w:sz w:val="22"/>
+          <w:szCs w:val="20"/>
+        </w:rPr>
+        <w:t></w:t>
+      </w:r>
+      <w:r>
+        <w:rPr>
+          <w:rFonts w:ascii="GWIPA" w:hAnsi="GWIPA" w:cs="Times New Roman"/>
+          <w:sz w:val="22"/>
+          <w:szCs w:val="20"/>
+        </w:rPr>
+        <w:t></w:t>
+      </w:r>
+      <w:r>
+        <w:rPr>
+          <w:rFonts w:ascii="GWIPA" w:hAnsi="GWIPA" w:cs="Times New Roman"/>
+          <w:sz w:val="22"/>
+          <w:szCs w:val="20"/>
+        </w:rPr>
+        <w:t></w:t>
+      </w:r>
+      <w:r>
+        <w:rPr>
+          <w:rFonts w:ascii="GWIPA" w:hAnsi="GWIPA" w:cs="Times New Roman"/>
+          <w:sz w:val="22"/>
+          <w:szCs w:val="20"/>
+        </w:rPr>
+        <w:t></w:t>
+      </w:r>
+      <w:r>
+        <w:rPr>
+          <w:rFonts w:ascii="GWIPA" w:hAnsi="GWIPA" w:cs="Times New Roman"/>
+          <w:sz w:val="22"/>
+          <w:szCs w:val="20"/>
+        </w:rPr>
+        <w:t></w:t>
+      </w:r>
+      <w:r>
+        <w:rPr>
+          <w:rFonts w:ascii="GWIPA" w:hAnsi="GWIPA" w:cs="Times New Roman"/>
+          <w:sz w:val="22"/>
+          <w:szCs w:val="20"/>
+        </w:rPr>
+        <w:t></w:t>
+      </w:r>
+      <w:r>
+        <w:rPr>
+          <w:rFonts w:ascii="GWIPA" w:hAnsi="GWIPA" w:cs="Times New Roman"/>
+          <w:sz w:val="22"/>
+          <w:szCs w:val="20"/>
+        </w:rPr>
+        <w:t></w:t>
+      </w:r>
+      <w:r>
+        <w:rPr>
+          <w:rFonts w:ascii="Times New Roman" w:hAnsi="Times New Roman" w:cs="Times New Roman" w:hint="eastAsia"/>
+          <w:sz w:val="22"/>
+          <w:szCs w:val="20"/>
+        </w:rPr>
+        <w:t>/</w:t>
+      </w:r>
+      <w:r>
+        <w:rPr>
+          <w:rFonts w:ascii="Times New Roman" w:hAnsi="Times New Roman" w:cs="Times New Roman"/>
+          <w:sz w:val="22"/>
+          <w:szCs w:val="20"/>
+        </w:rPr>
+        <w:br/>
+      </w:r>
+      <w:r>
+        <w:rPr>
+          <w:rFonts w:ascii="Times New Roman" w:hAnsi="Times New Roman" w:cs="Times New Roman" w:hint="eastAsia"/>
+          <w:sz w:val="22"/>
+          <w:szCs w:val="20"/>
+        </w:rPr>
         <w:lastRenderedPageBreak/>
-        <w:t>obscure</w:t>
-      </w:r>
-      <w:r>
-        <w:rPr>
-          <w:rFonts w:ascii="Times New Roman" w:hAnsi="Times New Roman" w:cs="Times New Roman" w:hint="eastAsia"/>
-          <w:sz w:val="22"/>
-          <w:szCs w:val="20"/>
-        </w:rPr>
-        <w:t xml:space="preserve"> /</w:t>
-      </w:r>
-      <w:r>
-        <w:rPr>
-          <w:rFonts w:ascii="GWIPA" w:hAnsi="GWIPA" w:cs="Times New Roman"/>
-          <w:sz w:val="22"/>
-          <w:szCs w:val="20"/>
-        </w:rPr>
-        <w:t></w:t>
-      </w:r>
-      <w:r>
-        <w:rPr>
-          <w:rFonts w:ascii="GWIPA" w:hAnsi="GWIPA" w:cs="Times New Roman"/>
-          <w:sz w:val="22"/>
-          <w:szCs w:val="20"/>
-        </w:rPr>
-        <w:t></w:t>
-      </w:r>
-      <w:r>
-        <w:rPr>
-          <w:rFonts w:ascii="GWIPA" w:hAnsi="GWIPA" w:cs="Times New Roman"/>
-          <w:sz w:val="22"/>
-          <w:szCs w:val="20"/>
-        </w:rPr>
-        <w:t></w:t>
-      </w:r>
-      <w:r>
-        <w:rPr>
-          <w:rFonts w:ascii="GWIPA" w:hAnsi="GWIPA" w:cs="Times New Roman"/>
-          <w:sz w:val="22"/>
-          <w:szCs w:val="20"/>
-        </w:rPr>
-        <w:t></w:t>
-      </w:r>
-      <w:r>
-        <w:rPr>
-          <w:rFonts w:ascii="GWIPA" w:hAnsi="GWIPA" w:cs="Times New Roman"/>
-          <w:sz w:val="22"/>
-          <w:szCs w:val="20"/>
-        </w:rPr>
-        <w:t></w:t>
-      </w:r>
-      <w:r>
-        <w:rPr>
-          <w:rFonts w:ascii="GWIPA" w:hAnsi="GWIPA" w:cs="Times New Roman"/>
-          <w:sz w:val="22"/>
-          <w:szCs w:val="20"/>
-        </w:rPr>
-        <w:t></w:t>
-      </w:r>
-      <w:r>
-        <w:rPr>
-          <w:rFonts w:ascii="GWIPA" w:hAnsi="GWIPA" w:cs="Times New Roman"/>
-          <w:sz w:val="22"/>
-          <w:szCs w:val="20"/>
-        </w:rPr>
-        <w:t></w:t>
-      </w:r>
-      <w:r>
-        <w:rPr>
-          <w:rFonts w:ascii="Times New Roman" w:hAnsi="Times New Roman" w:cs="Times New Roman" w:hint="eastAsia"/>
-          <w:sz w:val="22"/>
-          <w:szCs w:val="20"/>
-        </w:rPr>
-        <w:t>/</w:t>
-      </w:r>
-      <w:r>
-        <w:rPr>
-          <w:rFonts w:ascii="Times New Roman" w:hAnsi="Times New Roman" w:cs="Times New Roman"/>
+        <w:t>[adj.] difficult to understand.</w:t>
+      </w:r>
+    </w:p>
+    <w:p>
+      <w:pPr>
+        <w:jc w:val="left"/>
+        <w:rPr>
+          <w:rFonts w:ascii="Times New Roman" w:hAnsi="Times New Roman" w:cs="Times New Roman"/>
+          <w:sz w:val="22"/>
+          <w:szCs w:val="20"/>
+        </w:rPr>
+      </w:pPr>
+    </w:p>
+    <w:p>
+      <w:pPr>
+        <w:jc w:val="left"/>
+        <w:rPr>
+          <w:rFonts w:ascii="Times New Roman" w:hAnsi="Times New Roman" w:cs="Times New Roman"/>
+          <w:sz w:val="22"/>
+          <w:szCs w:val="20"/>
+        </w:rPr>
+      </w:pPr>
+      <w:r>
+        <w:rPr>
+          <w:rFonts w:ascii="Times New Roman" w:hAnsi="Times New Roman" w:cs="Times New Roman" w:hint="eastAsia"/>
+          <w:sz w:val="22"/>
+          <w:szCs w:val="20"/>
+        </w:rPr>
+        <w:t>cumulative</w:t>
+      </w:r>
+    </w:p>
+    <w:p>
+      <w:pPr>
+        <w:jc w:val="left"/>
+        <w:rPr>
+          <w:rFonts w:ascii="Times New Roman" w:hAnsi="Times New Roman" w:cs="Times New Roman"/>
+          <w:sz w:val="22"/>
+          <w:szCs w:val="20"/>
+        </w:rPr>
+      </w:pPr>
+    </w:p>
+    <w:p>
+      <w:pPr>
+        <w:jc w:val="left"/>
+        <w:rPr>
+          <w:rFonts w:ascii="Times New Roman" w:hAnsi="Times New Roman" w:cs="Times New Roman"/>
+          <w:sz w:val="22"/>
+          <w:szCs w:val="20"/>
+        </w:rPr>
+      </w:pPr>
+      <w:r>
+        <w:rPr>
+          <w:rFonts w:ascii="Times New Roman" w:hAnsi="Times New Roman" w:cs="Times New Roman" w:hint="eastAsia"/>
+          <w:sz w:val="22"/>
+          <w:szCs w:val="20"/>
+        </w:rPr>
+        <w:t>pernicious</w:t>
+      </w:r>
+    </w:p>
+    <w:p>
+      <w:pPr>
+        <w:jc w:val="left"/>
+        <w:rPr>
+          <w:rFonts w:ascii="Times New Roman" w:hAnsi="Times New Roman" w:cs="Times New Roman"/>
+          <w:sz w:val="22"/>
+          <w:szCs w:val="20"/>
+        </w:rPr>
+      </w:pPr>
+    </w:p>
+    <w:p>
+      <w:pPr>
+        <w:jc w:val="left"/>
+        <w:rPr>
+          <w:rFonts w:ascii="Times New Roman" w:hAnsi="Times New Roman" w:cs="Times New Roman"/>
+          <w:sz w:val="22"/>
+          <w:szCs w:val="20"/>
+        </w:rPr>
+      </w:pPr>
+      <w:r>
+        <w:rPr>
+          <w:rFonts w:ascii="Times New Roman" w:hAnsi="Times New Roman" w:cs="Times New Roman" w:hint="eastAsia"/>
+          <w:b/>
+          <w:sz w:val="22"/>
+          <w:szCs w:val="20"/>
+        </w:rPr>
+        <w:t>tamper-proof</w:t>
+      </w:r>
+      <w:r>
+        <w:rPr>
+          <w:rFonts w:ascii="Times New Roman" w:hAnsi="Times New Roman" w:cs="Times New Roman" w:hint="eastAsia"/>
+          <w:b/>
+          <w:sz w:val="22"/>
+          <w:szCs w:val="20"/>
+        </w:rPr>
+        <w:t xml:space="preserve">  </w:t>
+      </w:r>
+      <w:r>
+        <w:rPr>
+          <w:rFonts w:ascii="Times New Roman" w:hAnsi="Times New Roman" w:cs="Times New Roman" w:hint="eastAsia"/>
+          <w:i/>
+          <w:sz w:val="22"/>
+          <w:szCs w:val="20"/>
+        </w:rPr>
+        <w:t>(</w:t>
+      </w:r>
+      <w:r>
+        <w:rPr>
+          <w:rFonts w:ascii="Times New Roman" w:hAnsi="Times New Roman" w:cs="Times New Roman" w:hint="eastAsia"/>
+          <w:i/>
+          <w:sz w:val="22"/>
+          <w:szCs w:val="20"/>
+        </w:rPr>
+        <w:t xml:space="preserve">from </w:t>
+      </w:r>
+      <w:r>
+        <w:rPr>
+          <w:rFonts w:ascii="Times New Roman" w:hAnsi="Times New Roman" w:cs="Times New Roman" w:hint="eastAsia"/>
+          <w:i/>
+          <w:sz w:val="22"/>
+          <w:szCs w:val="20"/>
+        </w:rPr>
+        <w:t>bomb lab)</w:t>
+      </w:r>
+      <w:r>
+        <w:rPr>
+          <w:rFonts w:ascii="Times New Roman" w:hAnsi="Times New Roman" w:cs="Times New Roman"/>
+          <w:i/>
           <w:sz w:val="22"/>
           <w:szCs w:val="20"/>
         </w:rPr>
@@ -1454,7 +1766,23 @@
           <w:sz w:val="22"/>
           <w:szCs w:val="20"/>
         </w:rPr>
-        <w:t>[adj.] difficult to understand.</w:t>
+        <w:t>[adj.] something that is tamper-proof is specially designed so that it can NOT be easily changed or damaged.</w:t>
+      </w:r>
+      <w:r>
+        <w:rPr>
+          <w:rFonts w:ascii="Times New Roman" w:hAnsi="Times New Roman" w:cs="Times New Roman"/>
+          <w:sz w:val="22"/>
+          <w:szCs w:val="20"/>
+        </w:rPr>
+        <w:br/>
+      </w:r>
+      <w:r>
+        <w:rPr>
+          <w:rFonts w:ascii="Times New Roman" w:hAnsi="Times New Roman" w:cs="Times New Roman" w:hint="eastAsia"/>
+          <w:sz w:val="22"/>
+          <w:szCs w:val="20"/>
+        </w:rPr>
+        <w:t>a tamper-proof identity card.</w:t>
       </w:r>
     </w:p>
     <w:p>
@@ -1471,18 +1799,71 @@
       <w:pPr>
         <w:jc w:val="left"/>
         <w:rPr>
-          <w:rFonts w:ascii="Times New Roman" w:hAnsi="Times New Roman" w:cs="Times New Roman" w:hint="eastAsia"/>
-          <w:sz w:val="22"/>
-          <w:szCs w:val="20"/>
-        </w:rPr>
-      </w:pPr>
-      <w:r>
-        <w:rPr>
-          <w:rFonts w:ascii="Times New Roman" w:hAnsi="Times New Roman" w:cs="Times New Roman" w:hint="eastAsia"/>
-          <w:sz w:val="22"/>
-          <w:szCs w:val="20"/>
-        </w:rPr>
-        <w:t>cumulative</w:t>
+          <w:rFonts w:ascii="Times New Roman" w:hAnsi="Times New Roman" w:cs="Times New Roman"/>
+          <w:sz w:val="22"/>
+          <w:szCs w:val="20"/>
+        </w:rPr>
+      </w:pPr>
+      <w:r>
+        <w:rPr>
+          <w:rFonts w:ascii="Times New Roman" w:hAnsi="Times New Roman" w:cs="Times New Roman" w:hint="eastAsia"/>
+          <w:b/>
+          <w:sz w:val="22"/>
+          <w:szCs w:val="20"/>
+        </w:rPr>
+        <w:t>synthesis</w:t>
+      </w:r>
+      <w:r>
+        <w:rPr>
+          <w:rFonts w:ascii="Times New Roman" w:hAnsi="Times New Roman" w:cs="Times New Roman"/>
+          <w:sz w:val="22"/>
+          <w:szCs w:val="20"/>
+        </w:rPr>
+        <w:br/>
+      </w:r>
+      <w:r>
+        <w:rPr>
+          <w:rFonts w:ascii="Times New Roman" w:hAnsi="Times New Roman" w:cs="Times New Roman" w:hint="eastAsia"/>
+          <w:sz w:val="22"/>
+          <w:szCs w:val="20"/>
+        </w:rPr>
+        <w:t>[</w:t>
+      </w:r>
+      <w:proofErr w:type="spellStart"/>
+      <w:r>
+        <w:rPr>
+          <w:rFonts w:ascii="Times New Roman" w:hAnsi="Times New Roman" w:cs="Times New Roman" w:hint="eastAsia"/>
+          <w:sz w:val="22"/>
+          <w:szCs w:val="20"/>
+        </w:rPr>
+        <w:t>n.U</w:t>
+      </w:r>
+      <w:proofErr w:type="spellEnd"/>
+      <w:r>
+        <w:rPr>
+          <w:rFonts w:ascii="Times New Roman" w:hAnsi="Times New Roman" w:cs="Times New Roman" w:hint="eastAsia"/>
+          <w:sz w:val="22"/>
+          <w:szCs w:val="20"/>
+        </w:rPr>
+        <w:t xml:space="preserve">.] the act of combining separate ideas, beliefs, styles, </w:t>
+      </w:r>
+      <w:proofErr w:type="spellStart"/>
+      <w:r>
+        <w:rPr>
+          <w:rFonts w:ascii="Times New Roman" w:hAnsi="Times New Roman" w:cs="Times New Roman" w:hint="eastAsia"/>
+          <w:sz w:val="22"/>
+          <w:szCs w:val="20"/>
+        </w:rPr>
+        <w:t>etc</w:t>
+      </w:r>
+      <w:proofErr w:type="spellEnd"/>
+      <w:r>
+        <w:rPr>
+          <w:rFonts w:ascii="Times New Roman" w:hAnsi="Times New Roman" w:cs="Times New Roman" w:hint="eastAsia"/>
+          <w:sz w:val="22"/>
+          <w:szCs w:val="20"/>
+        </w:rPr>
+        <w:t xml:space="preserve">; a mixture or combination of ideas, beliefs, styles, etc. </w:t>
       </w:r>
     </w:p>
     <w:p>
@@ -1494,39 +1875,29 @@
           <w:szCs w:val="20"/>
         </w:rPr>
       </w:pPr>
+      <w:r>
+        <w:rPr>
+          <w:rFonts w:ascii="Times New Roman" w:hAnsi="Times New Roman" w:cs="Times New Roman" w:hint="eastAsia"/>
+          <w:sz w:val="22"/>
+          <w:szCs w:val="20"/>
+        </w:rPr>
+        <w:t xml:space="preserve">the synthesis of art and everyday life. </w:t>
+      </w:r>
     </w:p>
     <w:p>
       <w:pPr>
         <w:jc w:val="left"/>
         <w:rPr>
-          <w:rFonts w:ascii="Times New Roman" w:hAnsi="Times New Roman" w:cs="Times New Roman" w:hint="eastAsia"/>
-          <w:sz w:val="22"/>
-          <w:szCs w:val="20"/>
-        </w:rPr>
-      </w:pPr>
-      <w:r>
-        <w:rPr>
-          <w:rFonts w:ascii="Times New Roman" w:hAnsi="Times New Roman" w:cs="Times New Roman" w:hint="eastAsia"/>
-          <w:sz w:val="22"/>
-          <w:szCs w:val="20"/>
-        </w:rPr>
-        <w:t>pernicious</w:t>
-      </w:r>
+          <w:rFonts w:ascii="Times New Roman" w:hAnsi="Times New Roman" w:cs="Times New Roman"/>
+          <w:sz w:val="22"/>
+          <w:szCs w:val="20"/>
+        </w:rPr>
+      </w:pPr>
     </w:p>
     <w:p>
       <w:pPr>
         <w:jc w:val="left"/>
         <w:rPr>
-          <w:rFonts w:ascii="Times New Roman" w:hAnsi="Times New Roman" w:cs="Times New Roman"/>
-          <w:sz w:val="22"/>
-          <w:szCs w:val="20"/>
-        </w:rPr>
-      </w:pPr>
-    </w:p>
-    <w:p>
-      <w:pPr>
-        <w:jc w:val="left"/>
-        <w:rPr>
           <w:rFonts w:ascii="Times New Roman" w:hAnsi="Times New Roman" w:cs="Times New Roman" w:hint="eastAsia"/>
           <w:sz w:val="22"/>
           <w:szCs w:val="20"/>
@@ -1536,51 +1907,25 @@
         <w:rPr>
           <w:rFonts w:ascii="Times New Roman" w:hAnsi="Times New Roman" w:cs="Times New Roman" w:hint="eastAsia"/>
           <w:b/>
-          <w:sz w:val="22"/>
-          <w:szCs w:val="20"/>
-        </w:rPr>
-        <w:t>tamper-proof</w:t>
+          <w:bCs/>
+          <w:sz w:val="22"/>
+          <w:szCs w:val="20"/>
+        </w:rPr>
+        <w:t>subtlety</w:t>
       </w:r>
       <w:r>
         <w:rPr>
           <w:rFonts w:ascii="Times New Roman" w:hAnsi="Times New Roman" w:cs="Times New Roman" w:hint="eastAsia"/>
           <w:b/>
-          <w:sz w:val="22"/>
-          <w:szCs w:val="20"/>
-        </w:rPr>
-        <w:t xml:space="preserve">  </w:t>
-      </w:r>
-      <w:r>
-        <w:rPr>
-          <w:rFonts w:ascii="Times New Roman" w:hAnsi="Times New Roman" w:cs="Times New Roman" w:hint="eastAsia"/>
-          <w:i/>
-          <w:sz w:val="22"/>
-          <w:szCs w:val="20"/>
-        </w:rPr>
-        <w:t>(</w:t>
-      </w:r>
-      <w:r>
-        <w:rPr>
-          <w:rFonts w:ascii="Times New Roman" w:hAnsi="Times New Roman" w:cs="Times New Roman" w:hint="eastAsia"/>
-          <w:i/>
-          <w:sz w:val="22"/>
-          <w:szCs w:val="20"/>
-        </w:rPr>
-        <w:t xml:space="preserve">from </w:t>
-      </w:r>
-      <w:r>
-        <w:rPr>
-          <w:rFonts w:ascii="Times New Roman" w:hAnsi="Times New Roman" w:cs="Times New Roman" w:hint="eastAsia"/>
-          <w:i/>
-          <w:sz w:val="22"/>
-          <w:szCs w:val="20"/>
-        </w:rPr>
-        <w:t>bomb lab)</w:t>
-      </w:r>
-      <w:r>
-        <w:rPr>
-          <w:rFonts w:ascii="Times New Roman" w:hAnsi="Times New Roman" w:cs="Times New Roman"/>
-          <w:i/>
+          <w:bCs/>
+          <w:sz w:val="22"/>
+          <w:szCs w:val="20"/>
+        </w:rPr>
+        <w:t xml:space="preserve"> </w:t>
+      </w:r>
+      <w:r>
+        <w:rPr>
+          <w:rFonts w:ascii="Times New Roman" w:hAnsi="Times New Roman" w:cs="Times New Roman"/>
           <w:sz w:val="22"/>
           <w:szCs w:val="20"/>
         </w:rPr>
@@ -1592,7 +1937,7 @@
           <w:sz w:val="22"/>
           <w:szCs w:val="20"/>
         </w:rPr>
-        <w:t>[adj.] something that is tamper-proof is specially designed so that it can NOT be easily changed or damaged.</w:t>
+        <w:t xml:space="preserve">[C.] the small but important details or aspects of something. </w:t>
       </w:r>
       <w:r>
         <w:rPr>
@@ -1608,36 +1953,7 @@
           <w:sz w:val="22"/>
           <w:szCs w:val="20"/>
         </w:rPr>
-        <w:t>a tamper-proof identity card.</w:t>
-      </w:r>
-    </w:p>
-    <w:p>
-      <w:pPr>
-        <w:jc w:val="left"/>
-        <w:rPr>
-          <w:rFonts w:ascii="Times New Roman" w:hAnsi="Times New Roman" w:cs="Times New Roman" w:hint="eastAsia"/>
-          <w:sz w:val="22"/>
-          <w:szCs w:val="20"/>
-        </w:rPr>
-      </w:pPr>
-    </w:p>
-    <w:p>
-      <w:pPr>
-        <w:jc w:val="left"/>
-        <w:rPr>
-          <w:rFonts w:ascii="Times New Roman" w:hAnsi="Times New Roman" w:cs="Times New Roman" w:hint="eastAsia"/>
-          <w:sz w:val="22"/>
-          <w:szCs w:val="20"/>
-        </w:rPr>
-      </w:pPr>
-      <w:r>
-        <w:rPr>
-          <w:rFonts w:ascii="Times New Roman" w:hAnsi="Times New Roman" w:cs="Times New Roman" w:hint="eastAsia"/>
-          <w:b/>
-          <w:sz w:val="22"/>
-          <w:szCs w:val="20"/>
-        </w:rPr>
-        <w:t>synthesis</w:t>
+        <w:t xml:space="preserve">the subtleties of language. </w:t>
       </w:r>
       <w:r>
         <w:rPr>
@@ -1647,54 +1963,6 @@
         </w:rPr>
         <w:br/>
       </w:r>
-      <w:r>
-        <w:rPr>
-          <w:rFonts w:ascii="Times New Roman" w:hAnsi="Times New Roman" w:cs="Times New Roman" w:hint="eastAsia"/>
-          <w:sz w:val="22"/>
-          <w:szCs w:val="20"/>
-        </w:rPr>
-        <w:t xml:space="preserve">[n.U.] the act of combining separate ideas, beliefs, styles, etc; a mixture or combination of ideas, beliefs, styles, etc. </w:t>
-      </w:r>
-    </w:p>
-    <w:p>
-      <w:pPr>
-        <w:jc w:val="left"/>
-        <w:rPr>
-          <w:rFonts w:ascii="Times New Roman" w:hAnsi="Times New Roman" w:cs="Times New Roman" w:hint="eastAsia"/>
-          <w:sz w:val="22"/>
-          <w:szCs w:val="20"/>
-        </w:rPr>
-      </w:pPr>
-      <w:r>
-        <w:rPr>
-          <w:rFonts w:ascii="Times New Roman" w:hAnsi="Times New Roman" w:cs="Times New Roman" w:hint="eastAsia"/>
-          <w:sz w:val="22"/>
-          <w:szCs w:val="20"/>
-        </w:rPr>
-        <w:t xml:space="preserve">the synthesis of art and everyday life. </w:t>
-      </w:r>
-      <w:bookmarkStart w:id="0" w:name="_GoBack"/>
-      <w:bookmarkEnd w:id="0"/>
-    </w:p>
-    <w:p>
-      <w:pPr>
-        <w:jc w:val="left"/>
-        <w:rPr>
-          <w:rFonts w:ascii="Times New Roman" w:hAnsi="Times New Roman" w:cs="Times New Roman" w:hint="eastAsia"/>
-          <w:sz w:val="22"/>
-          <w:szCs w:val="20"/>
-        </w:rPr>
-      </w:pPr>
-    </w:p>
-    <w:p>
-      <w:pPr>
-        <w:jc w:val="left"/>
-        <w:rPr>
-          <w:rFonts w:ascii="Times New Roman" w:hAnsi="Times New Roman" w:cs="Times New Roman"/>
-          <w:sz w:val="22"/>
-          <w:szCs w:val="20"/>
-        </w:rPr>
-      </w:pPr>
     </w:p>
     <w:sectPr>
       <w:pgSz w:w="11906" w:h="16838"/>
@@ -1707,7 +1975,7 @@
 </file>
 
 <file path=word/endnotes.xml><?xml version="1.0" encoding="utf-8"?>
-<w:endnotes xmlns:wpc="http://schemas.microsoft.com/office/word/2010/wordprocessingCanvas" xmlns:mc="http://schemas.openxmlformats.org/markup-compatibility/2006" xmlns:o="urn:schemas-microsoft-com:office:office" xmlns:r="http://schemas.openxmlformats.org/officeDocument/2006/relationships" xmlns:m="http://schemas.openxmlformats.org/officeDocument/2006/math" xmlns:v="urn:schemas-microsoft-com:vml" xmlns:wp14="http://schemas.microsoft.com/office/word/2010/wordprocessingDrawing" xmlns:wp="http://schemas.openxmlformats.org/drawingml/2006/wordprocessingDrawing" xmlns:w10="urn:schemas-microsoft-com:office:word" xmlns:w="http://schemas.openxmlformats.org/wordprocessingml/2006/main" xmlns:w14="http://schemas.microsoft.com/office/word/2010/wordml" xmlns:wpg="http://schemas.microsoft.com/office/word/2010/wordprocessingGroup" xmlns:wpi="http://schemas.microsoft.com/office/word/2010/wordprocessingInk" xmlns:wne="http://schemas.microsoft.com/office/word/2006/wordml" xmlns:wps="http://schemas.microsoft.com/office/word/2010/wordprocessingShape" mc:Ignorable="w14 wp14">
+<w:endnotes xmlns:wpc="http://schemas.microsoft.com/office/word/2010/wordprocessingCanvas" xmlns:cx="http://schemas.microsoft.com/office/drawing/2014/chartex" xmlns:cx1="http://schemas.microsoft.com/office/drawing/2015/9/8/chartex" xmlns:cx2="http://schemas.microsoft.com/office/drawing/2015/10/21/chartex" xmlns:cx3="http://schemas.microsoft.com/office/drawing/2016/5/9/chartex" xmlns:cx4="http://schemas.microsoft.com/office/drawing/2016/5/10/chartex" xmlns:cx5="http://schemas.microsoft.com/office/drawing/2016/5/11/chartex" xmlns:cx6="http://schemas.microsoft.com/office/drawing/2016/5/12/chartex" xmlns:cx7="http://schemas.microsoft.com/office/drawing/2016/5/13/chartex" xmlns:cx8="http://schemas.microsoft.com/office/drawing/2016/5/14/chartex" xmlns:mc="http://schemas.openxmlformats.org/markup-compatibility/2006" xmlns:aink="http://schemas.microsoft.com/office/drawing/2016/ink" xmlns:am3d="http://schemas.microsoft.com/office/drawing/2017/model3d" xmlns:o="urn:schemas-microsoft-com:office:office" xmlns:oel="http://schemas.microsoft.com/office/2019/extlst" xmlns:r="http://schemas.openxmlformats.org/officeDocument/2006/relationships" xmlns:m="http://schemas.openxmlformats.org/officeDocument/2006/math" xmlns:v="urn:schemas-microsoft-com:vml" xmlns:wp14="http://schemas.microsoft.com/office/word/2010/wordprocessingDrawing" xmlns:wp="http://schemas.openxmlformats.org/drawingml/2006/wordprocessingDrawing" xmlns:w10="urn:schemas-microsoft-com:office:word" xmlns:w="http://schemas.openxmlformats.org/wordprocessingml/2006/main" xmlns:w14="http://schemas.microsoft.com/office/word/2010/wordml" xmlns:w15="http://schemas.microsoft.com/office/word/2012/wordml" xmlns:w16cex="http://schemas.microsoft.com/office/word/2018/wordml/cex" xmlns:w16cid="http://schemas.microsoft.com/office/word/2016/wordml/cid" xmlns:w16="http://schemas.microsoft.com/office/word/2018/wordml" xmlns:w16du="http://schemas.microsoft.com/office/word/2023/wordml/word16du" xmlns:w16sdtdh="http://schemas.microsoft.com/office/word/2020/wordml/sdtdatahash" xmlns:w16sdtfl="http://schemas.microsoft.com/office/word/2024/wordml/sdtformatlock" xmlns:w16se="http://schemas.microsoft.com/office/word/2015/wordml/symex" xmlns:wpg="http://schemas.microsoft.com/office/word/2010/wordprocessingGroup" xmlns:wpi="http://schemas.microsoft.com/office/word/2010/wordprocessingInk" xmlns:wne="http://schemas.microsoft.com/office/word/2006/wordml" xmlns:wps="http://schemas.microsoft.com/office/word/2010/wordprocessingShape" mc:Ignorable="w14 w15 w16se w16cid w16 w16cex w16sdtdh w16sdtfl w16du wp14">
   <w:endnote w:type="separator" w:id="-1">
     <w:p>
       <w:r>
@@ -1726,7 +1994,7 @@
 </file>
 
 <file path=word/footnotes.xml><?xml version="1.0" encoding="utf-8"?>
-<w:footnotes xmlns:wpc="http://schemas.microsoft.com/office/word/2010/wordprocessingCanvas" xmlns:mc="http://schemas.openxmlformats.org/markup-compatibility/2006" xmlns:o="urn:schemas-microsoft-com:office:office" xmlns:r="http://schemas.openxmlformats.org/officeDocument/2006/relationships" xmlns:m="http://schemas.openxmlformats.org/officeDocument/2006/math" xmlns:v="urn:schemas-microsoft-com:vml" xmlns:wp14="http://schemas.microsoft.com/office/word/2010/wordprocessingDrawing" xmlns:wp="http://schemas.openxmlformats.org/drawingml/2006/wordprocessingDrawing" xmlns:w10="urn:schemas-microsoft-com:office:word" xmlns:w="http://schemas.openxmlformats.org/wordprocessingml/2006/main" xmlns:w14="http://schemas.microsoft.com/office/word/2010/wordml" xmlns:wpg="http://schemas.microsoft.com/office/word/2010/wordprocessingGroup" xmlns:wpi="http://schemas.microsoft.com/office/word/2010/wordprocessingInk" xmlns:wne="http://schemas.microsoft.com/office/word/2006/wordml" xmlns:wps="http://schemas.microsoft.com/office/word/2010/wordprocessingShape" mc:Ignorable="w14 wp14">
+<w:footnotes xmlns:wpc="http://schemas.microsoft.com/office/word/2010/wordprocessingCanvas" xmlns:cx="http://schemas.microsoft.com/office/drawing/2014/chartex" xmlns:cx1="http://schemas.microsoft.com/office/drawing/2015/9/8/chartex" xmlns:cx2="http://schemas.microsoft.com/office/drawing/2015/10/21/chartex" xmlns:cx3="http://schemas.microsoft.com/office/drawing/2016/5/9/chartex" xmlns:cx4="http://schemas.microsoft.com/office/drawing/2016/5/10/chartex" xmlns:cx5="http://schemas.microsoft.com/office/drawing/2016/5/11/chartex" xmlns:cx6="http://schemas.microsoft.com/office/drawing/2016/5/12/chartex" xmlns:cx7="http://schemas.microsoft.com/office/drawing/2016/5/13/chartex" xmlns:cx8="http://schemas.microsoft.com/office/drawing/2016/5/14/chartex" xmlns:mc="http://schemas.openxmlformats.org/markup-compatibility/2006" xmlns:aink="http://schemas.microsoft.com/office/drawing/2016/ink" xmlns:am3d="http://schemas.microsoft.com/office/drawing/2017/model3d" xmlns:o="urn:schemas-microsoft-com:office:office" xmlns:oel="http://schemas.microsoft.com/office/2019/extlst" xmlns:r="http://schemas.openxmlformats.org/officeDocument/2006/relationships" xmlns:m="http://schemas.openxmlformats.org/officeDocument/2006/math" xmlns:v="urn:schemas-microsoft-com:vml" xmlns:wp14="http://schemas.microsoft.com/office/word/2010/wordprocessingDrawing" xmlns:wp="http://schemas.openxmlformats.org/drawingml/2006/wordprocessingDrawing" xmlns:w10="urn:schemas-microsoft-com:office:word" xmlns:w="http://schemas.openxmlformats.org/wordprocessingml/2006/main" xmlns:w14="http://schemas.microsoft.com/office/word/2010/wordml" xmlns:w15="http://schemas.microsoft.com/office/word/2012/wordml" xmlns:w16cex="http://schemas.microsoft.com/office/word/2018/wordml/cex" xmlns:w16cid="http://schemas.microsoft.com/office/word/2016/wordml/cid" xmlns:w16="http://schemas.microsoft.com/office/word/2018/wordml" xmlns:w16du="http://schemas.microsoft.com/office/word/2023/wordml/word16du" xmlns:w16sdtdh="http://schemas.microsoft.com/office/word/2020/wordml/sdtdatahash" xmlns:w16sdtfl="http://schemas.microsoft.com/office/word/2024/wordml/sdtformatlock" xmlns:w16se="http://schemas.microsoft.com/office/word/2015/wordml/symex" xmlns:wpg="http://schemas.microsoft.com/office/word/2010/wordprocessingGroup" xmlns:wpi="http://schemas.microsoft.com/office/word/2010/wordprocessingInk" xmlns:wne="http://schemas.microsoft.com/office/word/2006/wordml" xmlns:wps="http://schemas.microsoft.com/office/word/2010/wordprocessingShape" mc:Ignorable="w14 w15 w16se w16cid w16 w16cex w16sdtdh w16sdtfl w16du wp14">
   <w:footnote w:type="separator" w:id="-1">
     <w:p>
       <w:r>
@@ -1745,8 +2013,8 @@
 </file>
 
 <file path=word/numbering.xml><?xml version="1.0" encoding="utf-8"?>
-<w:numbering xmlns:wpc="http://schemas.microsoft.com/office/word/2010/wordprocessingCanvas" xmlns:mc="http://schemas.openxmlformats.org/markup-compatibility/2006" xmlns:o="urn:schemas-microsoft-com:office:office" xmlns:r="http://schemas.openxmlformats.org/officeDocument/2006/relationships" xmlns:m="http://schemas.openxmlformats.org/officeDocument/2006/math" xmlns:v="urn:schemas-microsoft-com:vml" xmlns:wp14="http://schemas.microsoft.com/office/word/2010/wordprocessingDrawing" xmlns:wp="http://schemas.openxmlformats.org/drawingml/2006/wordprocessingDrawing" xmlns:w10="urn:schemas-microsoft-com:office:word" xmlns:w="http://schemas.openxmlformats.org/wordprocessingml/2006/main" xmlns:w14="http://schemas.microsoft.com/office/word/2010/wordml" xmlns:wpg="http://schemas.microsoft.com/office/word/2010/wordprocessingGroup" xmlns:wpi="http://schemas.microsoft.com/office/word/2010/wordprocessingInk" xmlns:wne="http://schemas.microsoft.com/office/word/2006/wordml" xmlns:wps="http://schemas.microsoft.com/office/word/2010/wordprocessingShape" mc:Ignorable="w14 wp14">
-  <w:abstractNum w:abstractNumId="0">
+<w:numbering xmlns:wpc="http://schemas.microsoft.com/office/word/2010/wordprocessingCanvas" xmlns:cx="http://schemas.microsoft.com/office/drawing/2014/chartex" xmlns:cx1="http://schemas.microsoft.com/office/drawing/2015/9/8/chartex" xmlns:cx2="http://schemas.microsoft.com/office/drawing/2015/10/21/chartex" xmlns:cx3="http://schemas.microsoft.com/office/drawing/2016/5/9/chartex" xmlns:cx4="http://schemas.microsoft.com/office/drawing/2016/5/10/chartex" xmlns:cx5="http://schemas.microsoft.com/office/drawing/2016/5/11/chartex" xmlns:cx6="http://schemas.microsoft.com/office/drawing/2016/5/12/chartex" xmlns:cx7="http://schemas.microsoft.com/office/drawing/2016/5/13/chartex" xmlns:cx8="http://schemas.microsoft.com/office/drawing/2016/5/14/chartex" xmlns:mc="http://schemas.openxmlformats.org/markup-compatibility/2006" xmlns:aink="http://schemas.microsoft.com/office/drawing/2016/ink" xmlns:am3d="http://schemas.microsoft.com/office/drawing/2017/model3d" xmlns:o="urn:schemas-microsoft-com:office:office" xmlns:oel="http://schemas.microsoft.com/office/2019/extlst" xmlns:r="http://schemas.openxmlformats.org/officeDocument/2006/relationships" xmlns:m="http://schemas.openxmlformats.org/officeDocument/2006/math" xmlns:v="urn:schemas-microsoft-com:vml" xmlns:wp14="http://schemas.microsoft.com/office/word/2010/wordprocessingDrawing" xmlns:wp="http://schemas.openxmlformats.org/drawingml/2006/wordprocessingDrawing" xmlns:w10="urn:schemas-microsoft-com:office:word" xmlns:w="http://schemas.openxmlformats.org/wordprocessingml/2006/main" xmlns:w14="http://schemas.microsoft.com/office/word/2010/wordml" xmlns:w15="http://schemas.microsoft.com/office/word/2012/wordml" xmlns:w16cex="http://schemas.microsoft.com/office/word/2018/wordml/cex" xmlns:w16cid="http://schemas.microsoft.com/office/word/2016/wordml/cid" xmlns:w16="http://schemas.microsoft.com/office/word/2018/wordml" xmlns:w16du="http://schemas.microsoft.com/office/word/2023/wordml/word16du" xmlns:w16sdtdh="http://schemas.microsoft.com/office/word/2020/wordml/sdtdatahash" xmlns:w16sdtfl="http://schemas.microsoft.com/office/word/2024/wordml/sdtformatlock" xmlns:w16se="http://schemas.microsoft.com/office/word/2015/wordml/symex" xmlns:wpg="http://schemas.microsoft.com/office/word/2010/wordprocessingGroup" xmlns:wpi="http://schemas.microsoft.com/office/word/2010/wordprocessingInk" xmlns:wne="http://schemas.microsoft.com/office/word/2006/wordml" xmlns:wps="http://schemas.microsoft.com/office/word/2010/wordprocessingShape" mc:Ignorable="w14 w15 w16se w16cid w16 w16cex w16sdtdh w16sdtfl w16du wp14">
+  <w:abstractNum w:abstractNumId="0" w15:restartNumberingAfterBreak="0">
     <w:nsid w:val="56DC7672"/>
     <w:multiLevelType w:val="hybridMultilevel"/>
     <w:tmpl w:val="7E76FD4A"/>
@@ -1835,14 +2103,14 @@
       </w:pPr>
     </w:lvl>
   </w:abstractNum>
-  <w:num w:numId="1">
+  <w:num w:numId="1" w16cid:durableId="39670425">
     <w:abstractNumId w:val="0"/>
   </w:num>
 </w:numbering>
 </file>
 
 <file path=word/styles.xml><?xml version="1.0" encoding="utf-8"?>
-<w:styles xmlns:mc="http://schemas.openxmlformats.org/markup-compatibility/2006" xmlns:r="http://schemas.openxmlformats.org/officeDocument/2006/relationships" xmlns:w="http://schemas.openxmlformats.org/wordprocessingml/2006/main" xmlns:w14="http://schemas.microsoft.com/office/word/2010/wordml" mc:Ignorable="w14">
+<w:styles xmlns:mc="http://schemas.openxmlformats.org/markup-compatibility/2006" xmlns:r="http://schemas.openxmlformats.org/officeDocument/2006/relationships" xmlns:w="http://schemas.openxmlformats.org/wordprocessingml/2006/main" xmlns:w14="http://schemas.microsoft.com/office/word/2010/wordml" xmlns:w15="http://schemas.microsoft.com/office/word/2012/wordml" xmlns:w16cex="http://schemas.microsoft.com/office/word/2018/wordml/cex" xmlns:w16cid="http://schemas.microsoft.com/office/word/2016/wordml/cid" xmlns:w16="http://schemas.microsoft.com/office/word/2018/wordml" xmlns:w16du="http://schemas.microsoft.com/office/word/2023/wordml/word16du" xmlns:w16sdtdh="http://schemas.microsoft.com/office/word/2020/wordml/sdtdatahash" xmlns:w16sdtfl="http://schemas.microsoft.com/office/word/2024/wordml/sdtformatlock" xmlns:w16se="http://schemas.microsoft.com/office/word/2015/wordml/symex" mc:Ignorable="w14 w15 w16se w16cid w16 w16cex w16sdtdh w16sdtfl w16du">
   <w:docDefaults>
     <w:rPrDefault>
       <w:rPr>
@@ -1855,146 +2123,385 @@
     </w:rPrDefault>
     <w:pPrDefault/>
   </w:docDefaults>
-  <w:latentStyles w:defLockedState="0" w:defUIPriority="99" w:defSemiHidden="1" w:defUnhideWhenUsed="1" w:defQFormat="0" w:count="267">
-    <w:lsdException w:name="Normal" w:semiHidden="0" w:uiPriority="0" w:unhideWhenUsed="0" w:qFormat="1"/>
-    <w:lsdException w:name="heading 1" w:semiHidden="0" w:uiPriority="9" w:unhideWhenUsed="0" w:qFormat="1"/>
-    <w:lsdException w:name="heading 2" w:uiPriority="9" w:qFormat="1"/>
-    <w:lsdException w:name="heading 3" w:uiPriority="9" w:qFormat="1"/>
-    <w:lsdException w:name="heading 4" w:uiPriority="9" w:qFormat="1"/>
-    <w:lsdException w:name="heading 5" w:uiPriority="9" w:qFormat="1"/>
-    <w:lsdException w:name="heading 6" w:uiPriority="9" w:qFormat="1"/>
-    <w:lsdException w:name="heading 7" w:uiPriority="9" w:qFormat="1"/>
-    <w:lsdException w:name="heading 8" w:uiPriority="9" w:qFormat="1"/>
-    <w:lsdException w:name="heading 9" w:uiPriority="9" w:qFormat="1"/>
-    <w:lsdException w:name="toc 1" w:uiPriority="39"/>
-    <w:lsdException w:name="toc 2" w:uiPriority="39"/>
-    <w:lsdException w:name="toc 3" w:uiPriority="39"/>
-    <w:lsdException w:name="toc 4" w:uiPriority="39"/>
-    <w:lsdException w:name="toc 5" w:uiPriority="39"/>
-    <w:lsdException w:name="toc 6" w:uiPriority="39"/>
-    <w:lsdException w:name="toc 7" w:uiPriority="39"/>
-    <w:lsdException w:name="toc 8" w:uiPriority="39"/>
-    <w:lsdException w:name="toc 9" w:uiPriority="39"/>
-    <w:lsdException w:name="caption" w:uiPriority="35" w:qFormat="1"/>
-    <w:lsdException w:name="Title" w:semiHidden="0" w:uiPriority="10" w:unhideWhenUsed="0" w:qFormat="1"/>
-    <w:lsdException w:name="Default Paragraph Font" w:uiPriority="1"/>
-    <w:lsdException w:name="Subtitle" w:semiHidden="0" w:uiPriority="11" w:unhideWhenUsed="0" w:qFormat="1"/>
-    <w:lsdException w:name="Strong" w:semiHidden="0" w:uiPriority="22" w:unhideWhenUsed="0" w:qFormat="1"/>
-    <w:lsdException w:name="Emphasis" w:semiHidden="0" w:uiPriority="20" w:unhideWhenUsed="0" w:qFormat="1"/>
-    <w:lsdException w:name="Table Grid" w:semiHidden="0" w:uiPriority="59" w:unhideWhenUsed="0"/>
-    <w:lsdException w:name="Placeholder Text" w:unhideWhenUsed="0"/>
-    <w:lsdException w:name="No Spacing" w:semiHidden="0" w:uiPriority="1" w:unhideWhenUsed="0" w:qFormat="1"/>
-    <w:lsdException w:name="Light Shading" w:semiHidden="0" w:uiPriority="60" w:unhideWhenUsed="0"/>
-    <w:lsdException w:name="Light List" w:semiHidden="0" w:uiPriority="61" w:unhideWhenUsed="0"/>
-    <w:lsdException w:name="Light Grid" w:semiHidden="0" w:uiPriority="62" w:unhideWhenUsed="0"/>
-    <w:lsdException w:name="Medium Shading 1" w:semiHidden="0" w:uiPriority="63" w:unhideWhenUsed="0"/>
-    <w:lsdException w:name="Medium Shading 2" w:semiHidden="0" w:uiPriority="64" w:unhideWhenUsed="0"/>
-    <w:lsdException w:name="Medium List 1" w:semiHidden="0" w:uiPriority="65" w:unhideWhenUsed="0"/>
-    <w:lsdException w:name="Medium List 2" w:semiHidden="0" w:uiPriority="66" w:unhideWhenUsed="0"/>
-    <w:lsdException w:name="Medium Grid 1" w:semiHidden="0" w:uiPriority="67" w:unhideWhenUsed="0"/>
-    <w:lsdException w:name="Medium Grid 2" w:semiHidden="0" w:uiPriority="68" w:unhideWhenUsed="0"/>
-    <w:lsdException w:name="Medium Grid 3" w:semiHidden="0" w:uiPriority="69" w:unhideWhenUsed="0"/>
-    <w:lsdException w:name="Dark List" w:semiHidden="0" w:uiPriority="70" w:unhideWhenUsed="0"/>
-    <w:lsdException w:name="Colorful Shading" w:semiHidden="0" w:uiPriority="71" w:unhideWhenUsed="0"/>
-    <w:lsdException w:name="Colorful List" w:semiHidden="0" w:uiPriority="72" w:unhideWhenUsed="0"/>
-    <w:lsdException w:name="Colorful Grid" w:semiHidden="0" w:uiPriority="73" w:unhideWhenUsed="0"/>
-    <w:lsdException w:name="Light Shading Accent 1" w:semiHidden="0" w:uiPriority="60" w:unhideWhenUsed="0"/>
-    <w:lsdException w:name="Light List Accent 1" w:semiHidden="0" w:uiPriority="61" w:unhideWhenUsed="0"/>
-    <w:lsdException w:name="Light Grid Accent 1" w:semiHidden="0" w:uiPriority="62" w:unhideWhenUsed="0"/>
-    <w:lsdException w:name="Medium Shading 1 Accent 1" w:semiHidden="0" w:uiPriority="63" w:unhideWhenUsed="0"/>
-    <w:lsdException w:name="Medium Shading 2 Accent 1" w:semiHidden="0" w:uiPriority="64" w:unhideWhenUsed="0"/>
-    <w:lsdException w:name="Medium List 1 Accent 1" w:semiHidden="0" w:uiPriority="65" w:unhideWhenUsed="0"/>
-    <w:lsdException w:name="Revision" w:unhideWhenUsed="0"/>
-    <w:lsdException w:name="List Paragraph" w:semiHidden="0" w:uiPriority="34" w:unhideWhenUsed="0" w:qFormat="1"/>
-    <w:lsdException w:name="Quote" w:semiHidden="0" w:uiPriority="29" w:unhideWhenUsed="0" w:qFormat="1"/>
-    <w:lsdException w:name="Intense Quote" w:semiHidden="0" w:uiPriority="30" w:unhideWhenUsed="0" w:qFormat="1"/>
-    <w:lsdException w:name="Medium List 2 Accent 1" w:semiHidden="0" w:uiPriority="66" w:unhideWhenUsed="0"/>
-    <w:lsdException w:name="Medium Grid 1 Accent 1" w:semiHidden="0" w:uiPriority="67" w:unhideWhenUsed="0"/>
-    <w:lsdException w:name="Medium Grid 2 Accent 1" w:semiHidden="0" w:uiPriority="68" w:unhideWhenUsed="0"/>
-    <w:lsdException w:name="Medium Grid 3 Accent 1" w:semiHidden="0" w:uiPriority="69" w:unhideWhenUsed="0"/>
-    <w:lsdException w:name="Dark List Accent 1" w:semiHidden="0" w:uiPriority="70" w:unhideWhenUsed="0"/>
-    <w:lsdException w:name="Colorful Shading Accent 1" w:semiHidden="0" w:uiPriority="71" w:unhideWhenUsed="0"/>
-    <w:lsdException w:name="Colorful List Accent 1" w:semiHidden="0" w:uiPriority="72" w:unhideWhenUsed="0"/>
-    <w:lsdException w:name="Colorful Grid Accent 1" w:semiHidden="0" w:uiPriority="73" w:unhideWhenUsed="0"/>
-    <w:lsdException w:name="Light Shading Accent 2" w:semiHidden="0" w:uiPriority="60" w:unhideWhenUsed="0"/>
-    <w:lsdException w:name="Light List Accent 2" w:semiHidden="0" w:uiPriority="61" w:unhideWhenUsed="0"/>
-    <w:lsdException w:name="Light Grid Accent 2" w:semiHidden="0" w:uiPriority="62" w:unhideWhenUsed="0"/>
-    <w:lsdException w:name="Medium Shading 1 Accent 2" w:semiHidden="0" w:uiPriority="63" w:unhideWhenUsed="0"/>
-    <w:lsdException w:name="Medium Shading 2 Accent 2" w:semiHidden="0" w:uiPriority="64" w:unhideWhenUsed="0"/>
-    <w:lsdException w:name="Medium List 1 Accent 2" w:semiHidden="0" w:uiPriority="65" w:unhideWhenUsed="0"/>
-    <w:lsdException w:name="Medium List 2 Accent 2" w:semiHidden="0" w:uiPriority="66" w:unhideWhenUsed="0"/>
-    <w:lsdException w:name="Medium Grid 1 Accent 2" w:semiHidden="0" w:uiPriority="67" w:unhideWhenUsed="0"/>
-    <w:lsdException w:name="Medium Grid 2 Accent 2" w:semiHidden="0" w:uiPriority="68" w:unhideWhenUsed="0"/>
-    <w:lsdException w:name="Medium Grid 3 Accent 2" w:semiHidden="0" w:uiPriority="69" w:unhideWhenUsed="0"/>
-    <w:lsdException w:name="Dark List Accent 2" w:semiHidden="0" w:uiPriority="70" w:unhideWhenUsed="0"/>
-    <w:lsdException w:name="Colorful Shading Accent 2" w:semiHidden="0" w:uiPriority="71" w:unhideWhenUsed="0"/>
-    <w:lsdException w:name="Colorful List Accent 2" w:semiHidden="0" w:uiPriority="72" w:unhideWhenUsed="0"/>
-    <w:lsdException w:name="Colorful Grid Accent 2" w:semiHidden="0" w:uiPriority="73" w:unhideWhenUsed="0"/>
-    <w:lsdException w:name="Light Shading Accent 3" w:semiHidden="0" w:uiPriority="60" w:unhideWhenUsed="0"/>
-    <w:lsdException w:name="Light List Accent 3" w:semiHidden="0" w:uiPriority="61" w:unhideWhenUsed="0"/>
-    <w:lsdException w:name="Light Grid Accent 3" w:semiHidden="0" w:uiPriority="62" w:unhideWhenUsed="0"/>
-    <w:lsdException w:name="Medium Shading 1 Accent 3" w:semiHidden="0" w:uiPriority="63" w:unhideWhenUsed="0"/>
-    <w:lsdException w:name="Medium Shading 2 Accent 3" w:semiHidden="0" w:uiPriority="64" w:unhideWhenUsed="0"/>
-    <w:lsdException w:name="Medium List 1 Accent 3" w:semiHidden="0" w:uiPriority="65" w:unhideWhenUsed="0"/>
-    <w:lsdException w:name="Medium List 2 Accent 3" w:semiHidden="0" w:uiPriority="66" w:unhideWhenUsed="0"/>
-    <w:lsdException w:name="Medium Grid 1 Accent 3" w:semiHidden="0" w:uiPriority="67" w:unhideWhenUsed="0"/>
-    <w:lsdException w:name="Medium Grid 2 Accent 3" w:semiHidden="0" w:uiPriority="68" w:unhideWhenUsed="0"/>
-    <w:lsdException w:name="Medium Grid 3 Accent 3" w:semiHidden="0" w:uiPriority="69" w:unhideWhenUsed="0"/>
-    <w:lsdException w:name="Dark List Accent 3" w:semiHidden="0" w:uiPriority="70" w:unhideWhenUsed="0"/>
-    <w:lsdException w:name="Colorful Shading Accent 3" w:semiHidden="0" w:uiPriority="71" w:unhideWhenUsed="0"/>
-    <w:lsdException w:name="Colorful List Accent 3" w:semiHidden="0" w:uiPriority="72" w:unhideWhenUsed="0"/>
-    <w:lsdException w:name="Colorful Grid Accent 3" w:semiHidden="0" w:uiPriority="73" w:unhideWhenUsed="0"/>
-    <w:lsdException w:name="Light Shading Accent 4" w:semiHidden="0" w:uiPriority="60" w:unhideWhenUsed="0"/>
-    <w:lsdException w:name="Light List Accent 4" w:semiHidden="0" w:uiPriority="61" w:unhideWhenUsed="0"/>
-    <w:lsdException w:name="Light Grid Accent 4" w:semiHidden="0" w:uiPriority="62" w:unhideWhenUsed="0"/>
-    <w:lsdException w:name="Medium Shading 1 Accent 4" w:semiHidden="0" w:uiPriority="63" w:unhideWhenUsed="0"/>
-    <w:lsdException w:name="Medium Shading 2 Accent 4" w:semiHidden="0" w:uiPriority="64" w:unhideWhenUsed="0"/>
-    <w:lsdException w:name="Medium List 1 Accent 4" w:semiHidden="0" w:uiPriority="65" w:unhideWhenUsed="0"/>
-    <w:lsdException w:name="Medium List 2 Accent 4" w:semiHidden="0" w:uiPriority="66" w:unhideWhenUsed="0"/>
-    <w:lsdException w:name="Medium Grid 1 Accent 4" w:semiHidden="0" w:uiPriority="67" w:unhideWhenUsed="0"/>
-    <w:lsdException w:name="Medium Grid 2 Accent 4" w:semiHidden="0" w:uiPriority="68" w:unhideWhenUsed="0"/>
-    <w:lsdException w:name="Medium Grid 3 Accent 4" w:semiHidden="0" w:uiPriority="69" w:unhideWhenUsed="0"/>
-    <w:lsdException w:name="Dark List Accent 4" w:semiHidden="0" w:uiPriority="70" w:unhideWhenUsed="0"/>
-    <w:lsdException w:name="Colorful Shading Accent 4" w:semiHidden="0" w:uiPriority="71" w:unhideWhenUsed="0"/>
-    <w:lsdException w:name="Colorful List Accent 4" w:semiHidden="0" w:uiPriority="72" w:unhideWhenUsed="0"/>
-    <w:lsdException w:name="Colorful Grid Accent 4" w:semiHidden="0" w:uiPriority="73" w:unhideWhenUsed="0"/>
-    <w:lsdException w:name="Light Shading Accent 5" w:semiHidden="0" w:uiPriority="60" w:unhideWhenUsed="0"/>
-    <w:lsdException w:name="Light List Accent 5" w:semiHidden="0" w:uiPriority="61" w:unhideWhenUsed="0"/>
-    <w:lsdException w:name="Light Grid Accent 5" w:semiHidden="0" w:uiPriority="62" w:unhideWhenUsed="0"/>
-    <w:lsdException w:name="Medium Shading 1 Accent 5" w:semiHidden="0" w:uiPriority="63" w:unhideWhenUsed="0"/>
-    <w:lsdException w:name="Medium Shading 2 Accent 5" w:semiHidden="0" w:uiPriority="64" w:unhideWhenUsed="0"/>
-    <w:lsdException w:name="Medium List 1 Accent 5" w:semiHidden="0" w:uiPriority="65" w:unhideWhenUsed="0"/>
-    <w:lsdException w:name="Medium List 2 Accent 5" w:semiHidden="0" w:uiPriority="66" w:unhideWhenUsed="0"/>
-    <w:lsdException w:name="Medium Grid 1 Accent 5" w:semiHidden="0" w:uiPriority="67" w:unhideWhenUsed="0"/>
-    <w:lsdException w:name="Medium Grid 2 Accent 5" w:semiHidden="0" w:uiPriority="68" w:unhideWhenUsed="0"/>
-    <w:lsdException w:name="Medium Grid 3 Accent 5" w:semiHidden="0" w:uiPriority="69" w:unhideWhenUsed="0"/>
-    <w:lsdException w:name="Dark List Accent 5" w:semiHidden="0" w:uiPriority="70" w:unhideWhenUsed="0"/>
-    <w:lsdException w:name="Colorful Shading Accent 5" w:semiHidden="0" w:uiPriority="71" w:unhideWhenUsed="0"/>
-    <w:lsdException w:name="Colorful List Accent 5" w:semiHidden="0" w:uiPriority="72" w:unhideWhenUsed="0"/>
-    <w:lsdException w:name="Colorful Grid Accent 5" w:semiHidden="0" w:uiPriority="73" w:unhideWhenUsed="0"/>
-    <w:lsdException w:name="Light Shading Accent 6" w:semiHidden="0" w:uiPriority="60" w:unhideWhenUsed="0"/>
-    <w:lsdException w:name="Light List Accent 6" w:semiHidden="0" w:uiPriority="61" w:unhideWhenUsed="0"/>
-    <w:lsdException w:name="Light Grid Accent 6" w:semiHidden="0" w:uiPriority="62" w:unhideWhenUsed="0"/>
-    <w:lsdException w:name="Medium Shading 1 Accent 6" w:semiHidden="0" w:uiPriority="63" w:unhideWhenUsed="0"/>
-    <w:lsdException w:name="Medium Shading 2 Accent 6" w:semiHidden="0" w:uiPriority="64" w:unhideWhenUsed="0"/>
-    <w:lsdException w:name="Medium List 1 Accent 6" w:semiHidden="0" w:uiPriority="65" w:unhideWhenUsed="0"/>
-    <w:lsdException w:name="Medium List 2 Accent 6" w:semiHidden="0" w:uiPriority="66" w:unhideWhenUsed="0"/>
-    <w:lsdException w:name="Medium Grid 1 Accent 6" w:semiHidden="0" w:uiPriority="67" w:unhideWhenUsed="0"/>
-    <w:lsdException w:name="Medium Grid 2 Accent 6" w:semiHidden="0" w:uiPriority="68" w:unhideWhenUsed="0"/>
-    <w:lsdException w:name="Medium Grid 3 Accent 6" w:semiHidden="0" w:uiPriority="69" w:unhideWhenUsed="0"/>
-    <w:lsdException w:name="Dark List Accent 6" w:semiHidden="0" w:uiPriority="70" w:unhideWhenUsed="0"/>
-    <w:lsdException w:name="Colorful Shading Accent 6" w:semiHidden="0" w:uiPriority="71" w:unhideWhenUsed="0"/>
-    <w:lsdException w:name="Colorful List Accent 6" w:semiHidden="0" w:uiPriority="72" w:unhideWhenUsed="0"/>
-    <w:lsdException w:name="Colorful Grid Accent 6" w:semiHidden="0" w:uiPriority="73" w:unhideWhenUsed="0"/>
-    <w:lsdException w:name="Subtle Emphasis" w:semiHidden="0" w:uiPriority="19" w:unhideWhenUsed="0" w:qFormat="1"/>
-    <w:lsdException w:name="Intense Emphasis" w:semiHidden="0" w:uiPriority="21" w:unhideWhenUsed="0" w:qFormat="1"/>
-    <w:lsdException w:name="Subtle Reference" w:semiHidden="0" w:uiPriority="31" w:unhideWhenUsed="0" w:qFormat="1"/>
-    <w:lsdException w:name="Intense Reference" w:semiHidden="0" w:uiPriority="32" w:unhideWhenUsed="0" w:qFormat="1"/>
-    <w:lsdException w:name="Book Title" w:semiHidden="0" w:uiPriority="33" w:unhideWhenUsed="0" w:qFormat="1"/>
-    <w:lsdException w:name="Bibliography" w:uiPriority="37"/>
-    <w:lsdException w:name="TOC Heading" w:uiPriority="39" w:qFormat="1"/>
+  <w:latentStyles w:defLockedState="0" w:defUIPriority="99" w:defSemiHidden="0" w:defUnhideWhenUsed="0" w:defQFormat="0" w:count="376">
+    <w:lsdException w:name="Normal" w:uiPriority="0" w:qFormat="1"/>
+    <w:lsdException w:name="heading 1" w:uiPriority="9" w:qFormat="1"/>
+    <w:lsdException w:name="heading 2" w:semiHidden="1" w:uiPriority="9" w:unhideWhenUsed="1" w:qFormat="1"/>
+    <w:lsdException w:name="heading 3" w:semiHidden="1" w:uiPriority="9" w:unhideWhenUsed="1" w:qFormat="1"/>
+    <w:lsdException w:name="heading 4" w:semiHidden="1" w:uiPriority="9" w:unhideWhenUsed="1" w:qFormat="1"/>
+    <w:lsdException w:name="heading 5" w:semiHidden="1" w:uiPriority="9" w:unhideWhenUsed="1" w:qFormat="1"/>
+    <w:lsdException w:name="heading 6" w:semiHidden="1" w:uiPriority="9" w:unhideWhenUsed="1" w:qFormat="1"/>
+    <w:lsdException w:name="heading 7" w:semiHidden="1" w:uiPriority="9" w:unhideWhenUsed="1" w:qFormat="1"/>
+    <w:lsdException w:name="heading 8" w:semiHidden="1" w:uiPriority="9" w:unhideWhenUsed="1" w:qFormat="1"/>
+    <w:lsdException w:name="heading 9" w:semiHidden="1" w:uiPriority="9" w:unhideWhenUsed="1" w:qFormat="1"/>
+    <w:lsdException w:name="index 1" w:semiHidden="1" w:unhideWhenUsed="1"/>
+    <w:lsdException w:name="index 2" w:semiHidden="1" w:unhideWhenUsed="1"/>
+    <w:lsdException w:name="index 3" w:semiHidden="1" w:unhideWhenUsed="1"/>
+    <w:lsdException w:name="index 4" w:semiHidden="1" w:unhideWhenUsed="1"/>
+    <w:lsdException w:name="index 5" w:semiHidden="1" w:unhideWhenUsed="1"/>
+    <w:lsdException w:name="index 6" w:semiHidden="1" w:unhideWhenUsed="1"/>
+    <w:lsdException w:name="index 7" w:semiHidden="1" w:unhideWhenUsed="1"/>
+    <w:lsdException w:name="index 8" w:semiHidden="1" w:unhideWhenUsed="1"/>
+    <w:lsdException w:name="index 9" w:semiHidden="1" w:unhideWhenUsed="1"/>
+    <w:lsdException w:name="toc 1" w:semiHidden="1" w:uiPriority="39" w:unhideWhenUsed="1"/>
+    <w:lsdException w:name="toc 2" w:semiHidden="1" w:uiPriority="39" w:unhideWhenUsed="1"/>
+    <w:lsdException w:name="toc 3" w:semiHidden="1" w:uiPriority="39" w:unhideWhenUsed="1"/>
+    <w:lsdException w:name="toc 4" w:semiHidden="1" w:uiPriority="39" w:unhideWhenUsed="1"/>
+    <w:lsdException w:name="toc 5" w:semiHidden="1" w:uiPriority="39" w:unhideWhenUsed="1"/>
+    <w:lsdException w:name="toc 6" w:semiHidden="1" w:uiPriority="39" w:unhideWhenUsed="1"/>
+    <w:lsdException w:name="toc 7" w:semiHidden="1" w:uiPriority="39" w:unhideWhenUsed="1"/>
+    <w:lsdException w:name="toc 8" w:semiHidden="1" w:uiPriority="39" w:unhideWhenUsed="1"/>
+    <w:lsdException w:name="toc 9" w:semiHidden="1" w:uiPriority="39" w:unhideWhenUsed="1"/>
+    <w:lsdException w:name="Normal Indent" w:semiHidden="1" w:unhideWhenUsed="1"/>
+    <w:lsdException w:name="footnote text" w:semiHidden="1" w:unhideWhenUsed="1"/>
+    <w:lsdException w:name="annotation text" w:semiHidden="1" w:unhideWhenUsed="1"/>
+    <w:lsdException w:name="header" w:semiHidden="1" w:unhideWhenUsed="1"/>
+    <w:lsdException w:name="footer" w:semiHidden="1" w:unhideWhenUsed="1"/>
+    <w:lsdException w:name="index heading" w:semiHidden="1" w:unhideWhenUsed="1"/>
+    <w:lsdException w:name="caption" w:semiHidden="1" w:uiPriority="35" w:unhideWhenUsed="1" w:qFormat="1"/>
+    <w:lsdException w:name="table of figures" w:semiHidden="1" w:unhideWhenUsed="1"/>
+    <w:lsdException w:name="envelope address" w:semiHidden="1" w:unhideWhenUsed="1"/>
+    <w:lsdException w:name="envelope return" w:semiHidden="1" w:unhideWhenUsed="1"/>
+    <w:lsdException w:name="footnote reference" w:semiHidden="1" w:unhideWhenUsed="1"/>
+    <w:lsdException w:name="annotation reference" w:semiHidden="1" w:unhideWhenUsed="1"/>
+    <w:lsdException w:name="line number" w:semiHidden="1" w:unhideWhenUsed="1"/>
+    <w:lsdException w:name="page number" w:semiHidden="1" w:unhideWhenUsed="1"/>
+    <w:lsdException w:name="endnote reference" w:semiHidden="1" w:unhideWhenUsed="1"/>
+    <w:lsdException w:name="endnote text" w:semiHidden="1" w:unhideWhenUsed="1"/>
+    <w:lsdException w:name="table of authorities" w:semiHidden="1" w:unhideWhenUsed="1"/>
+    <w:lsdException w:name="macro" w:semiHidden="1" w:unhideWhenUsed="1"/>
+    <w:lsdException w:name="toa heading" w:semiHidden="1" w:unhideWhenUsed="1"/>
+    <w:lsdException w:name="List" w:semiHidden="1" w:unhideWhenUsed="1"/>
+    <w:lsdException w:name="List Bullet" w:semiHidden="1" w:unhideWhenUsed="1"/>
+    <w:lsdException w:name="List Number" w:semiHidden="1" w:unhideWhenUsed="1"/>
+    <w:lsdException w:name="List 2" w:semiHidden="1" w:unhideWhenUsed="1"/>
+    <w:lsdException w:name="List 3" w:semiHidden="1" w:unhideWhenUsed="1"/>
+    <w:lsdException w:name="List 4" w:semiHidden="1" w:unhideWhenUsed="1"/>
+    <w:lsdException w:name="List 5" w:semiHidden="1" w:unhideWhenUsed="1"/>
+    <w:lsdException w:name="List Bullet 2" w:semiHidden="1" w:unhideWhenUsed="1"/>
+    <w:lsdException w:name="List Bullet 3" w:semiHidden="1" w:unhideWhenUsed="1"/>
+    <w:lsdException w:name="List Bullet 4" w:semiHidden="1" w:unhideWhenUsed="1"/>
+    <w:lsdException w:name="List Bullet 5" w:semiHidden="1" w:unhideWhenUsed="1"/>
+    <w:lsdException w:name="List Number 2" w:semiHidden="1" w:unhideWhenUsed="1"/>
+    <w:lsdException w:name="List Number 3" w:semiHidden="1" w:unhideWhenUsed="1"/>
+    <w:lsdException w:name="List Number 4" w:semiHidden="1" w:unhideWhenUsed="1"/>
+    <w:lsdException w:name="List Number 5" w:semiHidden="1" w:unhideWhenUsed="1"/>
+    <w:lsdException w:name="Title" w:uiPriority="10" w:qFormat="1"/>
+    <w:lsdException w:name="Closing" w:semiHidden="1" w:unhideWhenUsed="1"/>
+    <w:lsdException w:name="Signature" w:semiHidden="1" w:unhideWhenUsed="1"/>
+    <w:lsdException w:name="Default Paragraph Font" w:semiHidden="1" w:uiPriority="1" w:unhideWhenUsed="1"/>
+    <w:lsdException w:name="Body Text" w:semiHidden="1" w:unhideWhenUsed="1"/>
+    <w:lsdException w:name="Body Text Indent" w:semiHidden="1" w:unhideWhenUsed="1"/>
+    <w:lsdException w:name="List Continue" w:semiHidden="1" w:unhideWhenUsed="1"/>
+    <w:lsdException w:name="List Continue 2" w:semiHidden="1" w:unhideWhenUsed="1"/>
+    <w:lsdException w:name="List Continue 3" w:semiHidden="1" w:unhideWhenUsed="1"/>
+    <w:lsdException w:name="List Continue 4" w:semiHidden="1" w:unhideWhenUsed="1"/>
+    <w:lsdException w:name="List Continue 5" w:semiHidden="1" w:unhideWhenUsed="1"/>
+    <w:lsdException w:name="Message Header" w:semiHidden="1" w:unhideWhenUsed="1"/>
+    <w:lsdException w:name="Subtitle" w:uiPriority="11" w:qFormat="1"/>
+    <w:lsdException w:name="Salutation" w:semiHidden="1" w:unhideWhenUsed="1"/>
+    <w:lsdException w:name="Date" w:semiHidden="1" w:unhideWhenUsed="1"/>
+    <w:lsdException w:name="Body Text First Indent" w:semiHidden="1" w:unhideWhenUsed="1"/>
+    <w:lsdException w:name="Body Text First Indent 2" w:semiHidden="1" w:unhideWhenUsed="1"/>
+    <w:lsdException w:name="Note Heading" w:semiHidden="1" w:unhideWhenUsed="1"/>
+    <w:lsdException w:name="Body Text 2" w:semiHidden="1" w:unhideWhenUsed="1"/>
+    <w:lsdException w:name="Body Text 3" w:semiHidden="1" w:unhideWhenUsed="1"/>
+    <w:lsdException w:name="Body Text Indent 2" w:semiHidden="1" w:unhideWhenUsed="1"/>
+    <w:lsdException w:name="Body Text Indent 3" w:semiHidden="1" w:unhideWhenUsed="1"/>
+    <w:lsdException w:name="Block Text" w:semiHidden="1" w:unhideWhenUsed="1"/>
+    <w:lsdException w:name="Hyperlink" w:semiHidden="1" w:unhideWhenUsed="1"/>
+    <w:lsdException w:name="FollowedHyperlink" w:semiHidden="1" w:unhideWhenUsed="1"/>
+    <w:lsdException w:name="Strong" w:uiPriority="22" w:qFormat="1"/>
+    <w:lsdException w:name="Emphasis" w:uiPriority="20" w:qFormat="1"/>
+    <w:lsdException w:name="Document Map" w:semiHidden="1" w:unhideWhenUsed="1"/>
+    <w:lsdException w:name="Plain Text" w:semiHidden="1" w:unhideWhenUsed="1"/>
+    <w:lsdException w:name="E-mail Signature" w:semiHidden="1" w:unhideWhenUsed="1"/>
+    <w:lsdException w:name="HTML Top of Form" w:semiHidden="1" w:unhideWhenUsed="1"/>
+    <w:lsdException w:name="HTML Bottom of Form" w:semiHidden="1" w:unhideWhenUsed="1"/>
+    <w:lsdException w:name="Normal (Web)" w:semiHidden="1" w:unhideWhenUsed="1"/>
+    <w:lsdException w:name="HTML Acronym" w:semiHidden="1" w:unhideWhenUsed="1"/>
+    <w:lsdException w:name="HTML Address" w:semiHidden="1" w:unhideWhenUsed="1"/>
+    <w:lsdException w:name="HTML Cite" w:semiHidden="1" w:unhideWhenUsed="1"/>
+    <w:lsdException w:name="HTML Code" w:semiHidden="1" w:unhideWhenUsed="1"/>
+    <w:lsdException w:name="HTML Definition" w:semiHidden="1" w:unhideWhenUsed="1"/>
+    <w:lsdException w:name="HTML Keyboard" w:semiHidden="1" w:unhideWhenUsed="1"/>
+    <w:lsdException w:name="HTML Preformatted" w:semiHidden="1" w:unhideWhenUsed="1"/>
+    <w:lsdException w:name="HTML Sample" w:semiHidden="1" w:unhideWhenUsed="1"/>
+    <w:lsdException w:name="HTML Typewriter" w:semiHidden="1" w:unhideWhenUsed="1"/>
+    <w:lsdException w:name="HTML Variable" w:semiHidden="1" w:unhideWhenUsed="1"/>
+    <w:lsdException w:name="Normal Table" w:semiHidden="1" w:unhideWhenUsed="1"/>
+    <w:lsdException w:name="annotation subject" w:semiHidden="1" w:unhideWhenUsed="1"/>
+    <w:lsdException w:name="No List" w:semiHidden="1" w:unhideWhenUsed="1"/>
+    <w:lsdException w:name="Outline List 1" w:semiHidden="1" w:unhideWhenUsed="1"/>
+    <w:lsdException w:name="Outline List 2" w:semiHidden="1" w:unhideWhenUsed="1"/>
+    <w:lsdException w:name="Outline List 3" w:semiHidden="1" w:unhideWhenUsed="1"/>
+    <w:lsdException w:name="Table Simple 1" w:semiHidden="1" w:unhideWhenUsed="1"/>
+    <w:lsdException w:name="Table Simple 2" w:semiHidden="1" w:unhideWhenUsed="1"/>
+    <w:lsdException w:name="Table Simple 3" w:semiHidden="1" w:unhideWhenUsed="1"/>
+    <w:lsdException w:name="Table Classic 1" w:semiHidden="1" w:unhideWhenUsed="1"/>
+    <w:lsdException w:name="Table Classic 2" w:semiHidden="1" w:unhideWhenUsed="1"/>
+    <w:lsdException w:name="Table Classic 3" w:semiHidden="1" w:unhideWhenUsed="1"/>
+    <w:lsdException w:name="Table Classic 4" w:semiHidden="1" w:unhideWhenUsed="1"/>
+    <w:lsdException w:name="Table Colorful 1" w:semiHidden="1" w:unhideWhenUsed="1"/>
+    <w:lsdException w:name="Table Colorful 2" w:semiHidden="1" w:unhideWhenUsed="1"/>
+    <w:lsdException w:name="Table Colorful 3" w:semiHidden="1" w:unhideWhenUsed="1"/>
+    <w:lsdException w:name="Table Columns 1" w:semiHidden="1" w:unhideWhenUsed="1"/>
+    <w:lsdException w:name="Table Columns 2" w:semiHidden="1" w:unhideWhenUsed="1"/>
+    <w:lsdException w:name="Table Columns 3" w:semiHidden="1" w:unhideWhenUsed="1"/>
+    <w:lsdException w:name="Table Columns 4" w:semiHidden="1" w:unhideWhenUsed="1"/>
+    <w:lsdException w:name="Table Columns 5" w:semiHidden="1" w:unhideWhenUsed="1"/>
+    <w:lsdException w:name="Table Grid 1" w:semiHidden="1" w:unhideWhenUsed="1"/>
+    <w:lsdException w:name="Table Grid 2" w:semiHidden="1" w:unhideWhenUsed="1"/>
+    <w:lsdException w:name="Table Grid 3" w:semiHidden="1" w:unhideWhenUsed="1"/>
+    <w:lsdException w:name="Table Grid 4" w:semiHidden="1" w:unhideWhenUsed="1"/>
+    <w:lsdException w:name="Table Grid 5" w:semiHidden="1" w:unhideWhenUsed="1"/>
+    <w:lsdException w:name="Table Grid 6" w:semiHidden="1" w:unhideWhenUsed="1"/>
+    <w:lsdException w:name="Table Grid 7" w:semiHidden="1" w:unhideWhenUsed="1"/>
+    <w:lsdException w:name="Table Grid 8" w:semiHidden="1" w:unhideWhenUsed="1"/>
+    <w:lsdException w:name="Table List 1" w:semiHidden="1" w:unhideWhenUsed="1"/>
+    <w:lsdException w:name="Table List 2" w:semiHidden="1" w:unhideWhenUsed="1"/>
+    <w:lsdException w:name="Table List 3" w:semiHidden="1" w:unhideWhenUsed="1"/>
+    <w:lsdException w:name="Table List 4" w:semiHidden="1" w:unhideWhenUsed="1"/>
+    <w:lsdException w:name="Table List 5" w:semiHidden="1" w:unhideWhenUsed="1"/>
+    <w:lsdException w:name="Table List 6" w:semiHidden="1" w:unhideWhenUsed="1"/>
+    <w:lsdException w:name="Table List 7" w:semiHidden="1" w:unhideWhenUsed="1"/>
+    <w:lsdException w:name="Table List 8" w:semiHidden="1" w:unhideWhenUsed="1"/>
+    <w:lsdException w:name="Table 3D effects 1" w:semiHidden="1" w:unhideWhenUsed="1"/>
+    <w:lsdException w:name="Table 3D effects 2" w:semiHidden="1" w:unhideWhenUsed="1"/>
+    <w:lsdException w:name="Table 3D effects 3" w:semiHidden="1" w:unhideWhenUsed="1"/>
+    <w:lsdException w:name="Table Contemporary" w:semiHidden="1" w:unhideWhenUsed="1"/>
+    <w:lsdException w:name="Table Elegant" w:semiHidden="1" w:unhideWhenUsed="1"/>
+    <w:lsdException w:name="Table Professional" w:semiHidden="1" w:unhideWhenUsed="1"/>
+    <w:lsdException w:name="Table Subtle 1" w:semiHidden="1" w:unhideWhenUsed="1"/>
+    <w:lsdException w:name="Table Subtle 2" w:semiHidden="1" w:unhideWhenUsed="1"/>
+    <w:lsdException w:name="Table Web 1" w:semiHidden="1" w:unhideWhenUsed="1"/>
+    <w:lsdException w:name="Table Web 2" w:semiHidden="1" w:unhideWhenUsed="1"/>
+    <w:lsdException w:name="Table Web 3" w:semiHidden="1" w:unhideWhenUsed="1"/>
+    <w:lsdException w:name="Balloon Text" w:semiHidden="1" w:unhideWhenUsed="1"/>
+    <w:lsdException w:name="Table Grid" w:uiPriority="59"/>
+    <w:lsdException w:name="Table Theme" w:semiHidden="1" w:unhideWhenUsed="1"/>
+    <w:lsdException w:name="Placeholder Text" w:semiHidden="1"/>
+    <w:lsdException w:name="No Spacing" w:uiPriority="1" w:qFormat="1"/>
+    <w:lsdException w:name="Light Shading" w:uiPriority="60"/>
+    <w:lsdException w:name="Light List" w:uiPriority="61"/>
+    <w:lsdException w:name="Light Grid" w:uiPriority="62"/>
+    <w:lsdException w:name="Medium Shading 1" w:uiPriority="63"/>
+    <w:lsdException w:name="Medium Shading 2" w:uiPriority="64"/>
+    <w:lsdException w:name="Medium List 1" w:uiPriority="65"/>
+    <w:lsdException w:name="Medium List 2" w:uiPriority="66"/>
+    <w:lsdException w:name="Medium Grid 1" w:uiPriority="67"/>
+    <w:lsdException w:name="Medium Grid 2" w:uiPriority="68"/>
+    <w:lsdException w:name="Medium Grid 3" w:uiPriority="69"/>
+    <w:lsdException w:name="Dark List" w:uiPriority="70"/>
+    <w:lsdException w:name="Colorful Shading" w:uiPriority="71"/>
+    <w:lsdException w:name="Colorful List" w:uiPriority="72"/>
+    <w:lsdException w:name="Colorful Grid" w:uiPriority="73"/>
+    <w:lsdException w:name="Light Shading Accent 1" w:uiPriority="60"/>
+    <w:lsdException w:name="Light List Accent 1" w:uiPriority="61"/>
+    <w:lsdException w:name="Light Grid Accent 1" w:uiPriority="62"/>
+    <w:lsdException w:name="Medium Shading 1 Accent 1" w:uiPriority="63"/>
+    <w:lsdException w:name="Medium Shading 2 Accent 1" w:uiPriority="64"/>
+    <w:lsdException w:name="Medium List 1 Accent 1" w:uiPriority="65"/>
+    <w:lsdException w:name="Revision" w:semiHidden="1"/>
+    <w:lsdException w:name="List Paragraph" w:uiPriority="34" w:qFormat="1"/>
+    <w:lsdException w:name="Quote" w:uiPriority="29" w:qFormat="1"/>
+    <w:lsdException w:name="Intense Quote" w:uiPriority="30" w:qFormat="1"/>
+    <w:lsdException w:name="Medium List 2 Accent 1" w:uiPriority="66"/>
+    <w:lsdException w:name="Medium Grid 1 Accent 1" w:uiPriority="67"/>
+    <w:lsdException w:name="Medium Grid 2 Accent 1" w:uiPriority="68"/>
+    <w:lsdException w:name="Medium Grid 3 Accent 1" w:uiPriority="69"/>
+    <w:lsdException w:name="Dark List Accent 1" w:uiPriority="70"/>
+    <w:lsdException w:name="Colorful Shading Accent 1" w:uiPriority="71"/>
+    <w:lsdException w:name="Colorful List Accent 1" w:uiPriority="72"/>
+    <w:lsdException w:name="Colorful Grid Accent 1" w:uiPriority="73"/>
+    <w:lsdException w:name="Light Shading Accent 2" w:uiPriority="60"/>
+    <w:lsdException w:name="Light List Accent 2" w:uiPriority="61"/>
+    <w:lsdException w:name="Light Grid Accent 2" w:uiPriority="62"/>
+    <w:lsdException w:name="Medium Shading 1 Accent 2" w:uiPriority="63"/>
+    <w:lsdException w:name="Medium Shading 2 Accent 2" w:uiPriority="64"/>
+    <w:lsdException w:name="Medium List 1 Accent 2" w:uiPriority="65"/>
+    <w:lsdException w:name="Medium List 2 Accent 2" w:uiPriority="66"/>
+    <w:lsdException w:name="Medium Grid 1 Accent 2" w:uiPriority="67"/>
+    <w:lsdException w:name="Medium Grid 2 Accent 2" w:uiPriority="68"/>
+    <w:lsdException w:name="Medium Grid 3 Accent 2" w:uiPriority="69"/>
+    <w:lsdException w:name="Dark List Accent 2" w:uiPriority="70"/>
+    <w:lsdException w:name="Colorful Shading Accent 2" w:uiPriority="71"/>
+    <w:lsdException w:name="Colorful List Accent 2" w:uiPriority="72"/>
+    <w:lsdException w:name="Colorful Grid Accent 2" w:uiPriority="73"/>
+    <w:lsdException w:name="Light Shading Accent 3" w:uiPriority="60"/>
+    <w:lsdException w:name="Light List Accent 3" w:uiPriority="61"/>
+    <w:lsdException w:name="Light Grid Accent 3" w:uiPriority="62"/>
+    <w:lsdException w:name="Medium Shading 1 Accent 3" w:uiPriority="63"/>
+    <w:lsdException w:name="Medium Shading 2 Accent 3" w:uiPriority="64"/>
+    <w:lsdException w:name="Medium List 1 Accent 3" w:uiPriority="65"/>
+    <w:lsdException w:name="Medium List 2 Accent 3" w:uiPriority="66"/>
+    <w:lsdException w:name="Medium Grid 1 Accent 3" w:uiPriority="67"/>
+    <w:lsdException w:name="Medium Grid 2 Accent 3" w:uiPriority="68"/>
+    <w:lsdException w:name="Medium Grid 3 Accent 3" w:uiPriority="69"/>
+    <w:lsdException w:name="Dark List Accent 3" w:uiPriority="70"/>
+    <w:lsdException w:name="Colorful Shading Accent 3" w:uiPriority="71"/>
+    <w:lsdException w:name="Colorful List Accent 3" w:uiPriority="72"/>
+    <w:lsdException w:name="Colorful Grid Accent 3" w:uiPriority="73"/>
+    <w:lsdException w:name="Light Shading Accent 4" w:uiPriority="60"/>
+    <w:lsdException w:name="Light List Accent 4" w:uiPriority="61"/>
+    <w:lsdException w:name="Light Grid Accent 4" w:uiPriority="62"/>
+    <w:lsdException w:name="Medium Shading 1 Accent 4" w:uiPriority="63"/>
+    <w:lsdException w:name="Medium Shading 2 Accent 4" w:uiPriority="64"/>
+    <w:lsdException w:name="Medium List 1 Accent 4" w:uiPriority="65"/>
+    <w:lsdException w:name="Medium List 2 Accent 4" w:uiPriority="66"/>
+    <w:lsdException w:name="Medium Grid 1 Accent 4" w:uiPriority="67"/>
+    <w:lsdException w:name="Medium Grid 2 Accent 4" w:uiPriority="68"/>
+    <w:lsdException w:name="Medium Grid 3 Accent 4" w:uiPriority="69"/>
+    <w:lsdException w:name="Dark List Accent 4" w:uiPriority="70"/>
+    <w:lsdException w:name="Colorful Shading Accent 4" w:uiPriority="71"/>
+    <w:lsdException w:name="Colorful List Accent 4" w:uiPriority="72"/>
+    <w:lsdException w:name="Colorful Grid Accent 4" w:uiPriority="73"/>
+    <w:lsdException w:name="Light Shading Accent 5" w:uiPriority="60"/>
+    <w:lsdException w:name="Light List Accent 5" w:uiPriority="61"/>
+    <w:lsdException w:name="Light Grid Accent 5" w:uiPriority="62"/>
+    <w:lsdException w:name="Medium Shading 1 Accent 5" w:uiPriority="63"/>
+    <w:lsdException w:name="Medium Shading 2 Accent 5" w:uiPriority="64"/>
+    <w:lsdException w:name="Medium List 1 Accent 5" w:uiPriority="65"/>
+    <w:lsdException w:name="Medium List 2 Accent 5" w:uiPriority="66"/>
+    <w:lsdException w:name="Medium Grid 1 Accent 5" w:uiPriority="67"/>
+    <w:lsdException w:name="Medium Grid 2 Accent 5" w:uiPriority="68"/>
+    <w:lsdException w:name="Medium Grid 3 Accent 5" w:uiPriority="69"/>
+    <w:lsdException w:name="Dark List Accent 5" w:uiPriority="70"/>
+    <w:lsdException w:name="Colorful Shading Accent 5" w:uiPriority="71"/>
+    <w:lsdException w:name="Colorful List Accent 5" w:uiPriority="72"/>
+    <w:lsdException w:name="Colorful Grid Accent 5" w:uiPriority="73"/>
+    <w:lsdException w:name="Light Shading Accent 6" w:uiPriority="60"/>
+    <w:lsdException w:name="Light List Accent 6" w:uiPriority="61"/>
+    <w:lsdException w:name="Light Grid Accent 6" w:uiPriority="62"/>
+    <w:lsdException w:name="Medium Shading 1 Accent 6" w:uiPriority="63"/>
+    <w:lsdException w:name="Medium Shading 2 Accent 6" w:uiPriority="64"/>
+    <w:lsdException w:name="Medium List 1 Accent 6" w:uiPriority="65"/>
+    <w:lsdException w:name="Medium List 2 Accent 6" w:uiPriority="66"/>
+    <w:lsdException w:name="Medium Grid 1 Accent 6" w:uiPriority="67"/>
+    <w:lsdException w:name="Medium Grid 2 Accent 6" w:uiPriority="68"/>
+    <w:lsdException w:name="Medium Grid 3 Accent 6" w:uiPriority="69"/>
+    <w:lsdException w:name="Dark List Accent 6" w:uiPriority="70"/>
+    <w:lsdException w:name="Colorful Shading Accent 6" w:uiPriority="71"/>
+    <w:lsdException w:name="Colorful List Accent 6" w:uiPriority="72"/>
+    <w:lsdException w:name="Colorful Grid Accent 6" w:uiPriority="73"/>
+    <w:lsdException w:name="Subtle Emphasis" w:uiPriority="19" w:qFormat="1"/>
+    <w:lsdException w:name="Intense Emphasis" w:uiPriority="21" w:qFormat="1"/>
+    <w:lsdException w:name="Subtle Reference" w:uiPriority="31" w:qFormat="1"/>
+    <w:lsdException w:name="Intense Reference" w:uiPriority="32" w:qFormat="1"/>
+    <w:lsdException w:name="Book Title" w:uiPriority="33" w:qFormat="1"/>
+    <w:lsdException w:name="Bibliography" w:semiHidden="1" w:uiPriority="37" w:unhideWhenUsed="1"/>
+    <w:lsdException w:name="TOC Heading" w:semiHidden="1" w:uiPriority="39" w:unhideWhenUsed="1" w:qFormat="1"/>
+    <w:lsdException w:name="Plain Table 1" w:uiPriority="41"/>
+    <w:lsdException w:name="Plain Table 2" w:uiPriority="42"/>
+    <w:lsdException w:name="Plain Table 3" w:uiPriority="43"/>
+    <w:lsdException w:name="Plain Table 4" w:uiPriority="44"/>
+    <w:lsdException w:name="Plain Table 5" w:uiPriority="45"/>
+    <w:lsdException w:name="Grid Table Light" w:uiPriority="40"/>
+    <w:lsdException w:name="Grid Table 1 Light" w:uiPriority="46"/>
+    <w:lsdException w:name="Grid Table 2" w:uiPriority="47"/>
+    <w:lsdException w:name="Grid Table 3" w:uiPriority="48"/>
+    <w:lsdException w:name="Grid Table 4" w:uiPriority="49"/>
+    <w:lsdException w:name="Grid Table 5 Dark" w:uiPriority="50"/>
+    <w:lsdException w:name="Grid Table 6 Colorful" w:uiPriority="51"/>
+    <w:lsdException w:name="Grid Table 7 Colorful" w:uiPriority="52"/>
+    <w:lsdException w:name="Grid Table 1 Light Accent 1" w:uiPriority="46"/>
+    <w:lsdException w:name="Grid Table 2 Accent 1" w:uiPriority="47"/>
+    <w:lsdException w:name="Grid Table 3 Accent 1" w:uiPriority="48"/>
+    <w:lsdException w:name="Grid Table 4 Accent 1" w:uiPriority="49"/>
+    <w:lsdException w:name="Grid Table 5 Dark Accent 1" w:uiPriority="50"/>
+    <w:lsdException w:name="Grid Table 6 Colorful Accent 1" w:uiPriority="51"/>
+    <w:lsdException w:name="Grid Table 7 Colorful Accent 1" w:uiPriority="52"/>
+    <w:lsdException w:name="Grid Table 1 Light Accent 2" w:uiPriority="46"/>
+    <w:lsdException w:name="Grid Table 2 Accent 2" w:uiPriority="47"/>
+    <w:lsdException w:name="Grid Table 3 Accent 2" w:uiPriority="48"/>
+    <w:lsdException w:name="Grid Table 4 Accent 2" w:uiPriority="49"/>
+    <w:lsdException w:name="Grid Table 5 Dark Accent 2" w:uiPriority="50"/>
+    <w:lsdException w:name="Grid Table 6 Colorful Accent 2" w:uiPriority="51"/>
+    <w:lsdException w:name="Grid Table 7 Colorful Accent 2" w:uiPriority="52"/>
+    <w:lsdException w:name="Grid Table 1 Light Accent 3" w:uiPriority="46"/>
+    <w:lsdException w:name="Grid Table 2 Accent 3" w:uiPriority="47"/>
+    <w:lsdException w:name="Grid Table 3 Accent 3" w:uiPriority="48"/>
+    <w:lsdException w:name="Grid Table 4 Accent 3" w:uiPriority="49"/>
+    <w:lsdException w:name="Grid Table 5 Dark Accent 3" w:uiPriority="50"/>
+    <w:lsdException w:name="Grid Table 6 Colorful Accent 3" w:uiPriority="51"/>
+    <w:lsdException w:name="Grid Table 7 Colorful Accent 3" w:uiPriority="52"/>
+    <w:lsdException w:name="Grid Table 1 Light Accent 4" w:uiPriority="46"/>
+    <w:lsdException w:name="Grid Table 2 Accent 4" w:uiPriority="47"/>
+    <w:lsdException w:name="Grid Table 3 Accent 4" w:uiPriority="48"/>
+    <w:lsdException w:name="Grid Table 4 Accent 4" w:uiPriority="49"/>
+    <w:lsdException w:name="Grid Table 5 Dark Accent 4" w:uiPriority="50"/>
+    <w:lsdException w:name="Grid Table 6 Colorful Accent 4" w:uiPriority="51"/>
+    <w:lsdException w:name="Grid Table 7 Colorful Accent 4" w:uiPriority="52"/>
+    <w:lsdException w:name="Grid Table 1 Light Accent 5" w:uiPriority="46"/>
+    <w:lsdException w:name="Grid Table 2 Accent 5" w:uiPriority="47"/>
+    <w:lsdException w:name="Grid Table 3 Accent 5" w:uiPriority="48"/>
+    <w:lsdException w:name="Grid Table 4 Accent 5" w:uiPriority="49"/>
+    <w:lsdException w:name="Grid Table 5 Dark Accent 5" w:uiPriority="50"/>
+    <w:lsdException w:name="Grid Table 6 Colorful Accent 5" w:uiPriority="51"/>
+    <w:lsdException w:name="Grid Table 7 Colorful Accent 5" w:uiPriority="52"/>
+    <w:lsdException w:name="Grid Table 1 Light Accent 6" w:uiPriority="46"/>
+    <w:lsdException w:name="Grid Table 2 Accent 6" w:uiPriority="47"/>
+    <w:lsdException w:name="Grid Table 3 Accent 6" w:uiPriority="48"/>
+    <w:lsdException w:name="Grid Table 4 Accent 6" w:uiPriority="49"/>
+    <w:lsdException w:name="Grid Table 5 Dark Accent 6" w:uiPriority="50"/>
+    <w:lsdException w:name="Grid Table 6 Colorful Accent 6" w:uiPriority="51"/>
+    <w:lsdException w:name="Grid Table 7 Colorful Accent 6" w:uiPriority="52"/>
+    <w:lsdException w:name="List Table 1 Light" w:uiPriority="46"/>
+    <w:lsdException w:name="List Table 2" w:uiPriority="47"/>
+    <w:lsdException w:name="List Table 3" w:uiPriority="48"/>
+    <w:lsdException w:name="List Table 4" w:uiPriority="49"/>
+    <w:lsdException w:name="List Table 5 Dark" w:uiPriority="50"/>
+    <w:lsdException w:name="List Table 6 Colorful" w:uiPriority="51"/>
+    <w:lsdException w:name="List Table 7 Colorful" w:uiPriority="52"/>
+    <w:lsdException w:name="List Table 1 Light Accent 1" w:uiPriority="46"/>
+    <w:lsdException w:name="List Table 2 Accent 1" w:uiPriority="47"/>
+    <w:lsdException w:name="List Table 3 Accent 1" w:uiPriority="48"/>
+    <w:lsdException w:name="List Table 4 Accent 1" w:uiPriority="49"/>
+    <w:lsdException w:name="List Table 5 Dark Accent 1" w:uiPriority="50"/>
+    <w:lsdException w:name="List Table 6 Colorful Accent 1" w:uiPriority="51"/>
+    <w:lsdException w:name="List Table 7 Colorful Accent 1" w:uiPriority="52"/>
+    <w:lsdException w:name="List Table 1 Light Accent 2" w:uiPriority="46"/>
+    <w:lsdException w:name="List Table 2 Accent 2" w:uiPriority="47"/>
+    <w:lsdException w:name="List Table 3 Accent 2" w:uiPriority="48"/>
+    <w:lsdException w:name="List Table 4 Accent 2" w:uiPriority="49"/>
+    <w:lsdException w:name="List Table 5 Dark Accent 2" w:uiPriority="50"/>
+    <w:lsdException w:name="List Table 6 Colorful Accent 2" w:uiPriority="51"/>
+    <w:lsdException w:name="List Table 7 Colorful Accent 2" w:uiPriority="52"/>
+    <w:lsdException w:name="List Table 1 Light Accent 3" w:uiPriority="46"/>
+    <w:lsdException w:name="List Table 2 Accent 3" w:uiPriority="47"/>
+    <w:lsdException w:name="List Table 3 Accent 3" w:uiPriority="48"/>
+    <w:lsdException w:name="List Table 4 Accent 3" w:uiPriority="49"/>
+    <w:lsdException w:name="List Table 5 Dark Accent 3" w:uiPriority="50"/>
+    <w:lsdException w:name="List Table 6 Colorful Accent 3" w:uiPriority="51"/>
+    <w:lsdException w:name="List Table 7 Colorful Accent 3" w:uiPriority="52"/>
+    <w:lsdException w:name="List Table 1 Light Accent 4" w:uiPriority="46"/>
+    <w:lsdException w:name="List Table 2 Accent 4" w:uiPriority="47"/>
+    <w:lsdException w:name="List Table 3 Accent 4" w:uiPriority="48"/>
+    <w:lsdException w:name="List Table 4 Accent 4" w:uiPriority="49"/>
+    <w:lsdException w:name="List Table 5 Dark Accent 4" w:uiPriority="50"/>
+    <w:lsdException w:name="List Table 6 Colorful Accent 4" w:uiPriority="51"/>
+    <w:lsdException w:name="List Table 7 Colorful Accent 4" w:uiPriority="52"/>
+    <w:lsdException w:name="List Table 1 Light Accent 5" w:uiPriority="46"/>
+    <w:lsdException w:name="List Table 2 Accent 5" w:uiPriority="47"/>
+    <w:lsdException w:name="List Table 3 Accent 5" w:uiPriority="48"/>
+    <w:lsdException w:name="List Table 4 Accent 5" w:uiPriority="49"/>
+    <w:lsdException w:name="List Table 5 Dark Accent 5" w:uiPriority="50"/>
+    <w:lsdException w:name="List Table 6 Colorful Accent 5" w:uiPriority="51"/>
+    <w:lsdException w:name="List Table 7 Colorful Accent 5" w:uiPriority="52"/>
+    <w:lsdException w:name="List Table 1 Light Accent 6" w:uiPriority="46"/>
+    <w:lsdException w:name="List Table 2 Accent 6" w:uiPriority="47"/>
+    <w:lsdException w:name="List Table 3 Accent 6" w:uiPriority="48"/>
+    <w:lsdException w:name="List Table 4 Accent 6" w:uiPriority="49"/>
+    <w:lsdException w:name="List Table 5 Dark Accent 6" w:uiPriority="50"/>
+    <w:lsdException w:name="List Table 6 Colorful Accent 6" w:uiPriority="51"/>
+    <w:lsdException w:name="List Table 7 Colorful Accent 6" w:uiPriority="52"/>
+    <w:lsdException w:name="Mention" w:semiHidden="1" w:unhideWhenUsed="1"/>
+    <w:lsdException w:name="Smart Hyperlink" w:semiHidden="1" w:unhideWhenUsed="1"/>
+    <w:lsdException w:name="Hashtag" w:semiHidden="1" w:unhideWhenUsed="1"/>
+    <w:lsdException w:name="Unresolved Mention" w:semiHidden="1" w:unhideWhenUsed="1"/>
+    <w:lsdException w:name="Smart Link" w:semiHidden="1" w:unhideWhenUsed="1"/>
   </w:latentStyles>
-  <w:style w:type="paragraph" w:default="1" w:styleId="a">
+  <w:style w:type="paragraph" w:default="1" w:styleId="Normal">
     <w:name w:val="Normal"/>
     <w:qFormat/>
     <w:rsid w:val="00E32F00"/>
@@ -2003,13 +2510,13 @@
       <w:jc w:val="both"/>
     </w:pPr>
   </w:style>
-  <w:style w:type="character" w:default="1" w:styleId="a0">
+  <w:style w:type="character" w:default="1" w:styleId="DefaultParagraphFont">
     <w:name w:val="Default Paragraph Font"/>
     <w:uiPriority w:val="1"/>
     <w:semiHidden/>
     <w:unhideWhenUsed/>
   </w:style>
-  <w:style w:type="table" w:default="1" w:styleId="a1">
+  <w:style w:type="table" w:default="1" w:styleId="TableNormal">
     <w:name w:val="Normal Table"/>
     <w:uiPriority w:val="99"/>
     <w:semiHidden/>
@@ -2024,15 +2531,15 @@
       </w:tblCellMar>
     </w:tblPr>
   </w:style>
-  <w:style w:type="numbering" w:default="1" w:styleId="a2">
+  <w:style w:type="numbering" w:default="1" w:styleId="NoList">
     <w:name w:val="No List"/>
     <w:uiPriority w:val="99"/>
     <w:semiHidden/>
     <w:unhideWhenUsed/>
   </w:style>
-  <w:style w:type="paragraph" w:styleId="a3">
+  <w:style w:type="paragraph" w:styleId="ListParagraph">
     <w:name w:val="List Paragraph"/>
-    <w:basedOn w:val="a"/>
+    <w:basedOn w:val="Normal"/>
     <w:uiPriority w:val="34"/>
     <w:qFormat/>
     <w:rsid w:val="00EB556C"/>
@@ -2040,10 +2547,10 @@
       <w:ind w:firstLineChars="200" w:firstLine="420"/>
     </w:pPr>
   </w:style>
-  <w:style w:type="paragraph" w:styleId="a4">
+  <w:style w:type="paragraph" w:styleId="Header">
     <w:name w:val="header"/>
-    <w:basedOn w:val="a"/>
-    <w:link w:val="Char"/>
+    <w:basedOn w:val="Normal"/>
+    <w:link w:val="HeaderChar"/>
     <w:uiPriority w:val="99"/>
     <w:unhideWhenUsed/>
     <w:rsid w:val="00F553D1"/>
@@ -2054,17 +2561,17 @@
       </w:tabs>
     </w:pPr>
   </w:style>
-  <w:style w:type="character" w:customStyle="1" w:styleId="Char">
-    <w:name w:val="页眉 Char"/>
-    <w:basedOn w:val="a0"/>
-    <w:link w:val="a4"/>
+  <w:style w:type="character" w:customStyle="1" w:styleId="HeaderChar">
+    <w:name w:val="Header Char"/>
+    <w:basedOn w:val="DefaultParagraphFont"/>
+    <w:link w:val="Header"/>
     <w:uiPriority w:val="99"/>
     <w:rsid w:val="00F553D1"/>
   </w:style>
-  <w:style w:type="paragraph" w:styleId="a5">
+  <w:style w:type="paragraph" w:styleId="Footer">
     <w:name w:val="footer"/>
-    <w:basedOn w:val="a"/>
-    <w:link w:val="Char0"/>
+    <w:basedOn w:val="Normal"/>
+    <w:link w:val="FooterChar"/>
     <w:uiPriority w:val="99"/>
     <w:unhideWhenUsed/>
     <w:rsid w:val="00F553D1"/>
@@ -2075,16 +2582,16 @@
       </w:tabs>
     </w:pPr>
   </w:style>
-  <w:style w:type="character" w:customStyle="1" w:styleId="Char0">
-    <w:name w:val="页脚 Char"/>
-    <w:basedOn w:val="a0"/>
-    <w:link w:val="a5"/>
+  <w:style w:type="character" w:customStyle="1" w:styleId="FooterChar">
+    <w:name w:val="Footer Char"/>
+    <w:basedOn w:val="DefaultParagraphFont"/>
+    <w:link w:val="Footer"/>
     <w:uiPriority w:val="99"/>
     <w:rsid w:val="00F553D1"/>
   </w:style>
-  <w:style w:type="character" w:styleId="a6">
+  <w:style w:type="character" w:styleId="Hyperlink">
     <w:name w:val="Hyperlink"/>
-    <w:basedOn w:val="a0"/>
+    <w:basedOn w:val="DefaultParagraphFont"/>
     <w:uiPriority w:val="99"/>
     <w:unhideWhenUsed/>
     <w:rsid w:val="00C661E5"/>
@@ -2093,275 +2600,9 @@
       <w:u w:val="single"/>
     </w:rPr>
   </w:style>
-  <w:style w:type="character" w:customStyle="1" w:styleId="UnresolvedMention">
-    <w:name w:val="Unresolved Mention"/>
-    <w:basedOn w:val="a0"/>
-    <w:uiPriority w:val="99"/>
-    <w:semiHidden/>
-    <w:unhideWhenUsed/>
-    <w:rsid w:val="00C661E5"/>
-    <w:rPr>
-      <w:color w:val="605E5C"/>
-      <w:shd w:val="clear" w:color="auto" w:fill="E1DFDD"/>
-    </w:rPr>
-  </w:style>
-</w:styles>
-</file>
-
-<file path=word/stylesWithEffects.xml><?xml version="1.0" encoding="utf-8"?>
-<w:styles xmlns:wpc="http://schemas.microsoft.com/office/word/2010/wordprocessingCanvas" xmlns:mc="http://schemas.openxmlformats.org/markup-compatibility/2006" xmlns:o="urn:schemas-microsoft-com:office:office" xmlns:r="http://schemas.openxmlformats.org/officeDocument/2006/relationships" xmlns:m="http://schemas.openxmlformats.org/officeDocument/2006/math" xmlns:v="urn:schemas-microsoft-com:vml" xmlns:wp14="http://schemas.microsoft.com/office/word/2010/wordprocessingDrawing" xmlns:wp="http://schemas.openxmlformats.org/drawingml/2006/wordprocessingDrawing" xmlns:w10="urn:schemas-microsoft-com:office:word" xmlns:w="http://schemas.openxmlformats.org/wordprocessingml/2006/main" xmlns:w14="http://schemas.microsoft.com/office/word/2010/wordml" xmlns:wpg="http://schemas.microsoft.com/office/word/2010/wordprocessingGroup" xmlns:wpi="http://schemas.microsoft.com/office/word/2010/wordprocessingInk" xmlns:wne="http://schemas.microsoft.com/office/word/2006/wordml" xmlns:wps="http://schemas.microsoft.com/office/word/2010/wordprocessingShape" mc:Ignorable="w14 wp14">
-  <w:docDefaults>
-    <w:rPrDefault>
-      <w:rPr>
-        <w:rFonts w:asciiTheme="minorHAnsi" w:eastAsiaTheme="minorEastAsia" w:hAnsiTheme="minorHAnsi" w:cstheme="minorBidi"/>
-        <w:kern w:val="2"/>
-        <w:sz w:val="21"/>
-        <w:szCs w:val="22"/>
-        <w:lang w:val="en-US" w:eastAsia="zh-CN" w:bidi="ar-SA"/>
-      </w:rPr>
-    </w:rPrDefault>
-    <w:pPrDefault/>
-  </w:docDefaults>
-  <w:latentStyles w:defLockedState="0" w:defUIPriority="99" w:defSemiHidden="1" w:defUnhideWhenUsed="1" w:defQFormat="0" w:count="267">
-    <w:lsdException w:name="Normal" w:semiHidden="0" w:uiPriority="0" w:unhideWhenUsed="0" w:qFormat="1"/>
-    <w:lsdException w:name="heading 1" w:semiHidden="0" w:uiPriority="9" w:unhideWhenUsed="0" w:qFormat="1"/>
-    <w:lsdException w:name="heading 2" w:uiPriority="9" w:qFormat="1"/>
-    <w:lsdException w:name="heading 3" w:uiPriority="9" w:qFormat="1"/>
-    <w:lsdException w:name="heading 4" w:uiPriority="9" w:qFormat="1"/>
-    <w:lsdException w:name="heading 5" w:uiPriority="9" w:qFormat="1"/>
-    <w:lsdException w:name="heading 6" w:uiPriority="9" w:qFormat="1"/>
-    <w:lsdException w:name="heading 7" w:uiPriority="9" w:qFormat="1"/>
-    <w:lsdException w:name="heading 8" w:uiPriority="9" w:qFormat="1"/>
-    <w:lsdException w:name="heading 9" w:uiPriority="9" w:qFormat="1"/>
-    <w:lsdException w:name="toc 1" w:uiPriority="39"/>
-    <w:lsdException w:name="toc 2" w:uiPriority="39"/>
-    <w:lsdException w:name="toc 3" w:uiPriority="39"/>
-    <w:lsdException w:name="toc 4" w:uiPriority="39"/>
-    <w:lsdException w:name="toc 5" w:uiPriority="39"/>
-    <w:lsdException w:name="toc 6" w:uiPriority="39"/>
-    <w:lsdException w:name="toc 7" w:uiPriority="39"/>
-    <w:lsdException w:name="toc 8" w:uiPriority="39"/>
-    <w:lsdException w:name="toc 9" w:uiPriority="39"/>
-    <w:lsdException w:name="caption" w:uiPriority="35" w:qFormat="1"/>
-    <w:lsdException w:name="Title" w:semiHidden="0" w:uiPriority="10" w:unhideWhenUsed="0" w:qFormat="1"/>
-    <w:lsdException w:name="Default Paragraph Font" w:uiPriority="1"/>
-    <w:lsdException w:name="Subtitle" w:semiHidden="0" w:uiPriority="11" w:unhideWhenUsed="0" w:qFormat="1"/>
-    <w:lsdException w:name="Strong" w:semiHidden="0" w:uiPriority="22" w:unhideWhenUsed="0" w:qFormat="1"/>
-    <w:lsdException w:name="Emphasis" w:semiHidden="0" w:uiPriority="20" w:unhideWhenUsed="0" w:qFormat="1"/>
-    <w:lsdException w:name="Table Grid" w:semiHidden="0" w:uiPriority="59" w:unhideWhenUsed="0"/>
-    <w:lsdException w:name="Placeholder Text" w:unhideWhenUsed="0"/>
-    <w:lsdException w:name="No Spacing" w:semiHidden="0" w:uiPriority="1" w:unhideWhenUsed="0" w:qFormat="1"/>
-    <w:lsdException w:name="Light Shading" w:semiHidden="0" w:uiPriority="60" w:unhideWhenUsed="0"/>
-    <w:lsdException w:name="Light List" w:semiHidden="0" w:uiPriority="61" w:unhideWhenUsed="0"/>
-    <w:lsdException w:name="Light Grid" w:semiHidden="0" w:uiPriority="62" w:unhideWhenUsed="0"/>
-    <w:lsdException w:name="Medium Shading 1" w:semiHidden="0" w:uiPriority="63" w:unhideWhenUsed="0"/>
-    <w:lsdException w:name="Medium Shading 2" w:semiHidden="0" w:uiPriority="64" w:unhideWhenUsed="0"/>
-    <w:lsdException w:name="Medium List 1" w:semiHidden="0" w:uiPriority="65" w:unhideWhenUsed="0"/>
-    <w:lsdException w:name="Medium List 2" w:semiHidden="0" w:uiPriority="66" w:unhideWhenUsed="0"/>
-    <w:lsdException w:name="Medium Grid 1" w:semiHidden="0" w:uiPriority="67" w:unhideWhenUsed="0"/>
-    <w:lsdException w:name="Medium Grid 2" w:semiHidden="0" w:uiPriority="68" w:unhideWhenUsed="0"/>
-    <w:lsdException w:name="Medium Grid 3" w:semiHidden="0" w:uiPriority="69" w:unhideWhenUsed="0"/>
-    <w:lsdException w:name="Dark List" w:semiHidden="0" w:uiPriority="70" w:unhideWhenUsed="0"/>
-    <w:lsdException w:name="Colorful Shading" w:semiHidden="0" w:uiPriority="71" w:unhideWhenUsed="0"/>
-    <w:lsdException w:name="Colorful List" w:semiHidden="0" w:uiPriority="72" w:unhideWhenUsed="0"/>
-    <w:lsdException w:name="Colorful Grid" w:semiHidden="0" w:uiPriority="73" w:unhideWhenUsed="0"/>
-    <w:lsdException w:name="Light Shading Accent 1" w:semiHidden="0" w:uiPriority="60" w:unhideWhenUsed="0"/>
-    <w:lsdException w:name="Light List Accent 1" w:semiHidden="0" w:uiPriority="61" w:unhideWhenUsed="0"/>
-    <w:lsdException w:name="Light Grid Accent 1" w:semiHidden="0" w:uiPriority="62" w:unhideWhenUsed="0"/>
-    <w:lsdException w:name="Medium Shading 1 Accent 1" w:semiHidden="0" w:uiPriority="63" w:unhideWhenUsed="0"/>
-    <w:lsdException w:name="Medium Shading 2 Accent 1" w:semiHidden="0" w:uiPriority="64" w:unhideWhenUsed="0"/>
-    <w:lsdException w:name="Medium List 1 Accent 1" w:semiHidden="0" w:uiPriority="65" w:unhideWhenUsed="0"/>
-    <w:lsdException w:name="Revision" w:unhideWhenUsed="0"/>
-    <w:lsdException w:name="List Paragraph" w:semiHidden="0" w:uiPriority="34" w:unhideWhenUsed="0" w:qFormat="1"/>
-    <w:lsdException w:name="Quote" w:semiHidden="0" w:uiPriority="29" w:unhideWhenUsed="0" w:qFormat="1"/>
-    <w:lsdException w:name="Intense Quote" w:semiHidden="0" w:uiPriority="30" w:unhideWhenUsed="0" w:qFormat="1"/>
-    <w:lsdException w:name="Medium List 2 Accent 1" w:semiHidden="0" w:uiPriority="66" w:unhideWhenUsed="0"/>
-    <w:lsdException w:name="Medium Grid 1 Accent 1" w:semiHidden="0" w:uiPriority="67" w:unhideWhenUsed="0"/>
-    <w:lsdException w:name="Medium Grid 2 Accent 1" w:semiHidden="0" w:uiPriority="68" w:unhideWhenUsed="0"/>
-    <w:lsdException w:name="Medium Grid 3 Accent 1" w:semiHidden="0" w:uiPriority="69" w:unhideWhenUsed="0"/>
-    <w:lsdException w:name="Dark List Accent 1" w:semiHidden="0" w:uiPriority="70" w:unhideWhenUsed="0"/>
-    <w:lsdException w:name="Colorful Shading Accent 1" w:semiHidden="0" w:uiPriority="71" w:unhideWhenUsed="0"/>
-    <w:lsdException w:name="Colorful List Accent 1" w:semiHidden="0" w:uiPriority="72" w:unhideWhenUsed="0"/>
-    <w:lsdException w:name="Colorful Grid Accent 1" w:semiHidden="0" w:uiPriority="73" w:unhideWhenUsed="0"/>
-    <w:lsdException w:name="Light Shading Accent 2" w:semiHidden="0" w:uiPriority="60" w:unhideWhenUsed="0"/>
-    <w:lsdException w:name="Light List Accent 2" w:semiHidden="0" w:uiPriority="61" w:unhideWhenUsed="0"/>
-    <w:lsdException w:name="Light Grid Accent 2" w:semiHidden="0" w:uiPriority="62" w:unhideWhenUsed="0"/>
-    <w:lsdException w:name="Medium Shading 1 Accent 2" w:semiHidden="0" w:uiPriority="63" w:unhideWhenUsed="0"/>
-    <w:lsdException w:name="Medium Shading 2 Accent 2" w:semiHidden="0" w:uiPriority="64" w:unhideWhenUsed="0"/>
-    <w:lsdException w:name="Medium List 1 Accent 2" w:semiHidden="0" w:uiPriority="65" w:unhideWhenUsed="0"/>
-    <w:lsdException w:name="Medium List 2 Accent 2" w:semiHidden="0" w:uiPriority="66" w:unhideWhenUsed="0"/>
-    <w:lsdException w:name="Medium Grid 1 Accent 2" w:semiHidden="0" w:uiPriority="67" w:unhideWhenUsed="0"/>
-    <w:lsdException w:name="Medium Grid 2 Accent 2" w:semiHidden="0" w:uiPriority="68" w:unhideWhenUsed="0"/>
-    <w:lsdException w:name="Medium Grid 3 Accent 2" w:semiHidden="0" w:uiPriority="69" w:unhideWhenUsed="0"/>
-    <w:lsdException w:name="Dark List Accent 2" w:semiHidden="0" w:uiPriority="70" w:unhideWhenUsed="0"/>
-    <w:lsdException w:name="Colorful Shading Accent 2" w:semiHidden="0" w:uiPriority="71" w:unhideWhenUsed="0"/>
-    <w:lsdException w:name="Colorful List Accent 2" w:semiHidden="0" w:uiPriority="72" w:unhideWhenUsed="0"/>
-    <w:lsdException w:name="Colorful Grid Accent 2" w:semiHidden="0" w:uiPriority="73" w:unhideWhenUsed="0"/>
-    <w:lsdException w:name="Light Shading Accent 3" w:semiHidden="0" w:uiPriority="60" w:unhideWhenUsed="0"/>
-    <w:lsdException w:name="Light List Accent 3" w:semiHidden="0" w:uiPriority="61" w:unhideWhenUsed="0"/>
-    <w:lsdException w:name="Light Grid Accent 3" w:semiHidden="0" w:uiPriority="62" w:unhideWhenUsed="0"/>
-    <w:lsdException w:name="Medium Shading 1 Accent 3" w:semiHidden="0" w:uiPriority="63" w:unhideWhenUsed="0"/>
-    <w:lsdException w:name="Medium Shading 2 Accent 3" w:semiHidden="0" w:uiPriority="64" w:unhideWhenUsed="0"/>
-    <w:lsdException w:name="Medium List 1 Accent 3" w:semiHidden="0" w:uiPriority="65" w:unhideWhenUsed="0"/>
-    <w:lsdException w:name="Medium List 2 Accent 3" w:semiHidden="0" w:uiPriority="66" w:unhideWhenUsed="0"/>
-    <w:lsdException w:name="Medium Grid 1 Accent 3" w:semiHidden="0" w:uiPriority="67" w:unhideWhenUsed="0"/>
-    <w:lsdException w:name="Medium Grid 2 Accent 3" w:semiHidden="0" w:uiPriority="68" w:unhideWhenUsed="0"/>
-    <w:lsdException w:name="Medium Grid 3 Accent 3" w:semiHidden="0" w:uiPriority="69" w:unhideWhenUsed="0"/>
-    <w:lsdException w:name="Dark List Accent 3" w:semiHidden="0" w:uiPriority="70" w:unhideWhenUsed="0"/>
-    <w:lsdException w:name="Colorful Shading Accent 3" w:semiHidden="0" w:uiPriority="71" w:unhideWhenUsed="0"/>
-    <w:lsdException w:name="Colorful List Accent 3" w:semiHidden="0" w:uiPriority="72" w:unhideWhenUsed="0"/>
-    <w:lsdException w:name="Colorful Grid Accent 3" w:semiHidden="0" w:uiPriority="73" w:unhideWhenUsed="0"/>
-    <w:lsdException w:name="Light Shading Accent 4" w:semiHidden="0" w:uiPriority="60" w:unhideWhenUsed="0"/>
-    <w:lsdException w:name="Light List Accent 4" w:semiHidden="0" w:uiPriority="61" w:unhideWhenUsed="0"/>
-    <w:lsdException w:name="Light Grid Accent 4" w:semiHidden="0" w:uiPriority="62" w:unhideWhenUsed="0"/>
-    <w:lsdException w:name="Medium Shading 1 Accent 4" w:semiHidden="0" w:uiPriority="63" w:unhideWhenUsed="0"/>
-    <w:lsdException w:name="Medium Shading 2 Accent 4" w:semiHidden="0" w:uiPriority="64" w:unhideWhenUsed="0"/>
-    <w:lsdException w:name="Medium List 1 Accent 4" w:semiHidden="0" w:uiPriority="65" w:unhideWhenUsed="0"/>
-    <w:lsdException w:name="Medium List 2 Accent 4" w:semiHidden="0" w:uiPriority="66" w:unhideWhenUsed="0"/>
-    <w:lsdException w:name="Medium Grid 1 Accent 4" w:semiHidden="0" w:uiPriority="67" w:unhideWhenUsed="0"/>
-    <w:lsdException w:name="Medium Grid 2 Accent 4" w:semiHidden="0" w:uiPriority="68" w:unhideWhenUsed="0"/>
-    <w:lsdException w:name="Medium Grid 3 Accent 4" w:semiHidden="0" w:uiPriority="69" w:unhideWhenUsed="0"/>
-    <w:lsdException w:name="Dark List Accent 4" w:semiHidden="0" w:uiPriority="70" w:unhideWhenUsed="0"/>
-    <w:lsdException w:name="Colorful Shading Accent 4" w:semiHidden="0" w:uiPriority="71" w:unhideWhenUsed="0"/>
-    <w:lsdException w:name="Colorful List Accent 4" w:semiHidden="0" w:uiPriority="72" w:unhideWhenUsed="0"/>
-    <w:lsdException w:name="Colorful Grid Accent 4" w:semiHidden="0" w:uiPriority="73" w:unhideWhenUsed="0"/>
-    <w:lsdException w:name="Light Shading Accent 5" w:semiHidden="0" w:uiPriority="60" w:unhideWhenUsed="0"/>
-    <w:lsdException w:name="Light List Accent 5" w:semiHidden="0" w:uiPriority="61" w:unhideWhenUsed="0"/>
-    <w:lsdException w:name="Light Grid Accent 5" w:semiHidden="0" w:uiPriority="62" w:unhideWhenUsed="0"/>
-    <w:lsdException w:name="Medium Shading 1 Accent 5" w:semiHidden="0" w:uiPriority="63" w:unhideWhenUsed="0"/>
-    <w:lsdException w:name="Medium Shading 2 Accent 5" w:semiHidden="0" w:uiPriority="64" w:unhideWhenUsed="0"/>
-    <w:lsdException w:name="Medium List 1 Accent 5" w:semiHidden="0" w:uiPriority="65" w:unhideWhenUsed="0"/>
-    <w:lsdException w:name="Medium List 2 Accent 5" w:semiHidden="0" w:uiPriority="66" w:unhideWhenUsed="0"/>
-    <w:lsdException w:name="Medium Grid 1 Accent 5" w:semiHidden="0" w:uiPriority="67" w:unhideWhenUsed="0"/>
-    <w:lsdException w:name="Medium Grid 2 Accent 5" w:semiHidden="0" w:uiPriority="68" w:unhideWhenUsed="0"/>
-    <w:lsdException w:name="Medium Grid 3 Accent 5" w:semiHidden="0" w:uiPriority="69" w:unhideWhenUsed="0"/>
-    <w:lsdException w:name="Dark List Accent 5" w:semiHidden="0" w:uiPriority="70" w:unhideWhenUsed="0"/>
-    <w:lsdException w:name="Colorful Shading Accent 5" w:semiHidden="0" w:uiPriority="71" w:unhideWhenUsed="0"/>
-    <w:lsdException w:name="Colorful List Accent 5" w:semiHidden="0" w:uiPriority="72" w:unhideWhenUsed="0"/>
-    <w:lsdException w:name="Colorful Grid Accent 5" w:semiHidden="0" w:uiPriority="73" w:unhideWhenUsed="0"/>
-    <w:lsdException w:name="Light Shading Accent 6" w:semiHidden="0" w:uiPriority="60" w:unhideWhenUsed="0"/>
-    <w:lsdException w:name="Light List Accent 6" w:semiHidden="0" w:uiPriority="61" w:unhideWhenUsed="0"/>
-    <w:lsdException w:name="Light Grid Accent 6" w:semiHidden="0" w:uiPriority="62" w:unhideWhenUsed="0"/>
-    <w:lsdException w:name="Medium Shading 1 Accent 6" w:semiHidden="0" w:uiPriority="63" w:unhideWhenUsed="0"/>
-    <w:lsdException w:name="Medium Shading 2 Accent 6" w:semiHidden="0" w:uiPriority="64" w:unhideWhenUsed="0"/>
-    <w:lsdException w:name="Medium List 1 Accent 6" w:semiHidden="0" w:uiPriority="65" w:unhideWhenUsed="0"/>
-    <w:lsdException w:name="Medium List 2 Accent 6" w:semiHidden="0" w:uiPriority="66" w:unhideWhenUsed="0"/>
-    <w:lsdException w:name="Medium Grid 1 Accent 6" w:semiHidden="0" w:uiPriority="67" w:unhideWhenUsed="0"/>
-    <w:lsdException w:name="Medium Grid 2 Accent 6" w:semiHidden="0" w:uiPriority="68" w:unhideWhenUsed="0"/>
-    <w:lsdException w:name="Medium Grid 3 Accent 6" w:semiHidden="0" w:uiPriority="69" w:unhideWhenUsed="0"/>
-    <w:lsdException w:name="Dark List Accent 6" w:semiHidden="0" w:uiPriority="70" w:unhideWhenUsed="0"/>
-    <w:lsdException w:name="Colorful Shading Accent 6" w:semiHidden="0" w:uiPriority="71" w:unhideWhenUsed="0"/>
-    <w:lsdException w:name="Colorful List Accent 6" w:semiHidden="0" w:uiPriority="72" w:unhideWhenUsed="0"/>
-    <w:lsdException w:name="Colorful Grid Accent 6" w:semiHidden="0" w:uiPriority="73" w:unhideWhenUsed="0"/>
-    <w:lsdException w:name="Subtle Emphasis" w:semiHidden="0" w:uiPriority="19" w:unhideWhenUsed="0" w:qFormat="1"/>
-    <w:lsdException w:name="Intense Emphasis" w:semiHidden="0" w:uiPriority="21" w:unhideWhenUsed="0" w:qFormat="1"/>
-    <w:lsdException w:name="Subtle Reference" w:semiHidden="0" w:uiPriority="31" w:unhideWhenUsed="0" w:qFormat="1"/>
-    <w:lsdException w:name="Intense Reference" w:semiHidden="0" w:uiPriority="32" w:unhideWhenUsed="0" w:qFormat="1"/>
-    <w:lsdException w:name="Book Title" w:semiHidden="0" w:uiPriority="33" w:unhideWhenUsed="0" w:qFormat="1"/>
-    <w:lsdException w:name="Bibliography" w:uiPriority="37"/>
-    <w:lsdException w:name="TOC Heading" w:uiPriority="39" w:qFormat="1"/>
-  </w:latentStyles>
-  <w:style w:type="paragraph" w:default="1" w:styleId="a">
-    <w:name w:val="Normal"/>
-    <w:qFormat/>
-    <w:pPr>
-      <w:widowControl w:val="0"/>
-      <w:jc w:val="both"/>
-    </w:pPr>
-  </w:style>
-  <w:style w:type="character" w:default="1" w:styleId="a0">
-    <w:name w:val="Default Paragraph Font"/>
-    <w:uiPriority w:val="1"/>
-    <w:semiHidden/>
-    <w:unhideWhenUsed/>
-  </w:style>
-  <w:style w:type="table" w:default="1" w:styleId="a1">
-    <w:name w:val="Normal Table"/>
-    <w:uiPriority w:val="99"/>
-    <w:semiHidden/>
-    <w:unhideWhenUsed/>
-    <w:tblPr>
-      <w:tblInd w:w="0" w:type="dxa"/>
-      <w:tblCellMar>
-        <w:top w:w="0" w:type="dxa"/>
-        <w:left w:w="108" w:type="dxa"/>
-        <w:bottom w:w="0" w:type="dxa"/>
-        <w:right w:w="108" w:type="dxa"/>
-      </w:tblCellMar>
-    </w:tblPr>
-  </w:style>
-  <w:style w:type="numbering" w:default="1" w:styleId="a2">
-    <w:name w:val="No List"/>
-    <w:uiPriority w:val="99"/>
-    <w:semiHidden/>
-    <w:unhideWhenUsed/>
-  </w:style>
-  <w:style w:type="paragraph" w:styleId="a3">
-    <w:name w:val="List Paragraph"/>
-    <w:basedOn w:val="a"/>
-    <w:uiPriority w:val="34"/>
-    <w:qFormat/>
-    <w:rsid w:val="00EB556C"/>
-    <w:pPr>
-      <w:ind w:firstLineChars="200" w:firstLine="420"/>
-    </w:pPr>
-  </w:style>
-  <w:style w:type="paragraph" w:styleId="a4">
-    <w:name w:val="header"/>
-    <w:basedOn w:val="a"/>
-    <w:link w:val="Char"/>
-    <w:uiPriority w:val="99"/>
-    <w:unhideWhenUsed/>
-    <w:rsid w:val="00F553D1"/>
-    <w:pPr>
-      <w:tabs>
-        <w:tab w:val="center" w:pos="4153"/>
-        <w:tab w:val="right" w:pos="8306"/>
-      </w:tabs>
-    </w:pPr>
-  </w:style>
-  <w:style w:type="character" w:customStyle="1" w:styleId="Char">
-    <w:name w:val="页眉 Char"/>
-    <w:basedOn w:val="a0"/>
-    <w:link w:val="a4"/>
-    <w:uiPriority w:val="99"/>
-    <w:rsid w:val="00F553D1"/>
-  </w:style>
-  <w:style w:type="paragraph" w:styleId="a5">
-    <w:name w:val="footer"/>
-    <w:basedOn w:val="a"/>
-    <w:link w:val="Char0"/>
-    <w:uiPriority w:val="99"/>
-    <w:unhideWhenUsed/>
-    <w:rsid w:val="00F553D1"/>
-    <w:pPr>
-      <w:tabs>
-        <w:tab w:val="center" w:pos="4153"/>
-        <w:tab w:val="right" w:pos="8306"/>
-      </w:tabs>
-    </w:pPr>
-  </w:style>
-  <w:style w:type="character" w:customStyle="1" w:styleId="Char0">
-    <w:name w:val="页脚 Char"/>
-    <w:basedOn w:val="a0"/>
-    <w:link w:val="a5"/>
-    <w:uiPriority w:val="99"/>
-    <w:rsid w:val="00F553D1"/>
-  </w:style>
-  <w:style w:type="character" w:styleId="a6">
-    <w:name w:val="Hyperlink"/>
-    <w:basedOn w:val="a0"/>
-    <w:uiPriority w:val="99"/>
-    <w:unhideWhenUsed/>
-    <w:rsid w:val="00C661E5"/>
-    <w:rPr>
-      <w:color w:val="0000FF" w:themeColor="hyperlink"/>
-      <w:u w:val="single"/>
-    </w:rPr>
-  </w:style>
-  <w:style w:type="character" w:customStyle="1" w:styleId="UnresolvedMention">
-    <w:name w:val="Unresolved Mention"/>
-    <w:basedOn w:val="a0"/>
+  <w:style w:type="character" w:customStyle="1" w:styleId="UnresolvedMention1">
+    <w:name w:val="Unresolved Mention1"/>
+    <w:basedOn w:val="DefaultParagraphFont"/>
     <w:uiPriority w:val="99"/>
     <w:semiHidden/>
     <w:unhideWhenUsed/>

</xml_diff>

<commit_message>
udpate note of sum.ys
</commit_message>
<xml_diff>
--- a/CSAPP/Vocabulary of CSAPP.docx
+++ b/CSAPP/Vocabulary of CSAPP.docx
@@ -185,6 +185,7 @@
         </w:rPr>
         <w:t>[</w:t>
       </w:r>
+      <w:proofErr w:type="gramStart"/>
       <w:r>
         <w:rPr>
           <w:rFonts w:ascii="Arial" w:hAnsi="Arial" w:cs="Arial"/>
@@ -211,6 +212,7 @@
         <w:t>arraged</w:t>
       </w:r>
       <w:proofErr w:type="spellEnd"/>
+      <w:proofErr w:type="gramEnd"/>
       <w:r>
         <w:rPr>
           <w:rFonts w:ascii="Arial" w:hAnsi="Arial" w:cs="Arial"/>
@@ -257,6 +259,7 @@
           <w:szCs w:val="24"/>
         </w:rPr>
       </w:pPr>
+      <w:proofErr w:type="gramStart"/>
       <w:r>
         <w:rPr>
           <w:rFonts w:ascii="Arial" w:hAnsi="Arial" w:cs="Arial"/>
@@ -265,7 +268,18 @@
           <w:sz w:val="24"/>
           <w:szCs w:val="24"/>
         </w:rPr>
-        <w:t xml:space="preserve">process : </w:t>
+        <w:t>process :</w:t>
+      </w:r>
+      <w:proofErr w:type="gramEnd"/>
+      <w:r>
+        <w:rPr>
+          <w:rFonts w:ascii="Arial" w:hAnsi="Arial" w:cs="Arial"/>
+          <w:b/>
+          <w:bCs/>
+          <w:sz w:val="24"/>
+          <w:szCs w:val="24"/>
+        </w:rPr>
+        <w:t xml:space="preserve"> </w:t>
       </w:r>
       <w:r>
         <w:rPr>
@@ -455,17 +469,63 @@
           <w:sz w:val="24"/>
           <w:szCs w:val="24"/>
         </w:rPr>
-        <w:t>[n.]</w:t>
-      </w:r>
-      <w:r>
-        <w:rPr>
-          <w:rFonts w:ascii="Times New Roman" w:hAnsi="Times New Roman" w:cs="Times New Roman"/>
-          <w:sz w:val="24"/>
-          <w:szCs w:val="24"/>
-        </w:rPr>
-        <w:t>The significand[1] (also coefficient,[1] sometimes argument, or more ambiguously mantissa,[2] fraction,[3][4][</w:t>
+        <w:t>[</w:t>
+      </w:r>
+      <w:proofErr w:type="gramStart"/>
+      <w:r>
+        <w:rPr>
+          <w:rFonts w:ascii="Times New Roman" w:hAnsi="Times New Roman" w:cs="Times New Roman"/>
+          <w:sz w:val="24"/>
+          <w:szCs w:val="24"/>
+        </w:rPr>
+        <w:t>n.]</w:t>
+      </w:r>
+      <w:r>
+        <w:rPr>
+          <w:rFonts w:ascii="Times New Roman" w:hAnsi="Times New Roman" w:cs="Times New Roman"/>
+          <w:sz w:val="24"/>
+          <w:szCs w:val="24"/>
+        </w:rPr>
+        <w:t>The</w:t>
+      </w:r>
+      <w:proofErr w:type="gramEnd"/>
+      <w:r>
+        <w:rPr>
+          <w:rFonts w:ascii="Times New Roman" w:hAnsi="Times New Roman" w:cs="Times New Roman"/>
+          <w:sz w:val="24"/>
+          <w:szCs w:val="24"/>
+        </w:rPr>
+        <w:t xml:space="preserve"> </w:t>
+      </w:r>
+      <w:proofErr w:type="gramStart"/>
+      <w:r>
+        <w:rPr>
+          <w:rFonts w:ascii="Times New Roman" w:hAnsi="Times New Roman" w:cs="Times New Roman"/>
+          <w:sz w:val="24"/>
+          <w:szCs w:val="24"/>
+        </w:rPr>
+        <w:t>significand[</w:t>
+      </w:r>
+      <w:proofErr w:type="gramEnd"/>
+      <w:r>
+        <w:rPr>
+          <w:rFonts w:ascii="Times New Roman" w:hAnsi="Times New Roman" w:cs="Times New Roman"/>
+          <w:sz w:val="24"/>
+          <w:szCs w:val="24"/>
+        </w:rPr>
+        <w:t>1] (also coefficient,[1] sometimes argument, or more ambiguously mantissa,[2] fraction,[3][</w:t>
+      </w:r>
+      <w:proofErr w:type="gramStart"/>
+      <w:r>
+        <w:rPr>
+          <w:rFonts w:ascii="Times New Roman" w:hAnsi="Times New Roman" w:cs="Times New Roman"/>
+          <w:sz w:val="24"/>
+          <w:szCs w:val="24"/>
+        </w:rPr>
+        <w:t>4][</w:t>
       </w:r>
       <w:proofErr w:type="spellStart"/>
+      <w:proofErr w:type="gramEnd"/>
       <w:r>
         <w:rPr>
           <w:rFonts w:ascii="Times New Roman" w:hAnsi="Times New Roman" w:cs="Times New Roman"/>
@@ -481,7 +541,25 @@
           <w:sz w:val="24"/>
           <w:szCs w:val="24"/>
         </w:rPr>
-        <w:t xml:space="preserve"> 1] or characteristic[5][2]) is the first (left) part of a number in scientific notation or related concepts in floating-point representation</w:t>
+        <w:t xml:space="preserve"> 1] or </w:t>
+      </w:r>
+      <w:proofErr w:type="gramStart"/>
+      <w:r>
+        <w:rPr>
+          <w:rFonts w:ascii="Times New Roman" w:hAnsi="Times New Roman" w:cs="Times New Roman"/>
+          <w:sz w:val="24"/>
+          <w:szCs w:val="24"/>
+        </w:rPr>
+        <w:t>characteristic[</w:t>
+      </w:r>
+      <w:proofErr w:type="gramEnd"/>
+      <w:r>
+        <w:rPr>
+          <w:rFonts w:ascii="Times New Roman" w:hAnsi="Times New Roman" w:cs="Times New Roman"/>
+          <w:sz w:val="24"/>
+          <w:szCs w:val="24"/>
+        </w:rPr>
+        <w:t>5][2]) is the first (left) part of a number in scientific notation or related concepts in floating-point representation</w:t>
       </w:r>
       <w:r>
         <w:rPr>
@@ -743,6 +821,7 @@
         </w:rPr>
         <w:t></w:t>
       </w:r>
+      <w:proofErr w:type="gramStart"/>
       <w:r>
         <w:rPr>
           <w:rFonts w:ascii="Arial" w:hAnsi="Arial" w:cs="Arial" w:hint="eastAsia"/>
@@ -759,6 +838,7 @@
         </w:rPr>
         <w:t xml:space="preserve"> (</w:t>
       </w:r>
+      <w:proofErr w:type="gramEnd"/>
       <w:r>
         <w:rPr>
           <w:rFonts w:ascii="Arial" w:hAnsi="Arial" w:cs="Arial" w:hint="eastAsia"/>
@@ -1057,6 +1137,7 @@
         </w:rPr>
         <w:t></w:t>
       </w:r>
+      <w:proofErr w:type="gramStart"/>
       <w:r>
         <w:rPr>
           <w:rFonts w:ascii="Times New Roman" w:hAnsi="Times New Roman" w:cs="Times New Roman" w:hint="eastAsia"/>
@@ -1071,7 +1152,16 @@
           <w:sz w:val="22"/>
           <w:szCs w:val="24"/>
         </w:rPr>
-        <w:t xml:space="preserve">  (Page 278)</w:t>
+        <w:t xml:space="preserve">  (</w:t>
+      </w:r>
+      <w:proofErr w:type="gramEnd"/>
+      <w:r>
+        <w:rPr>
+          <w:rFonts w:ascii="Times New Roman" w:hAnsi="Times New Roman" w:cs="Times New Roman" w:hint="eastAsia"/>
+          <w:sz w:val="22"/>
+          <w:szCs w:val="24"/>
+        </w:rPr>
+        <w:t>Page 278)</w:t>
       </w:r>
       <w:r>
         <w:rPr>
@@ -1315,7 +1405,7 @@
           <w:sz w:val="22"/>
           <w:szCs w:val="20"/>
         </w:rPr>
-        <w:t xml:space="preserve">] to be </w:t>
+        <w:t>] to be enough for sb/</w:t>
       </w:r>
       <w:proofErr w:type="spellStart"/>
       <w:r>
@@ -1324,7 +1414,7 @@
           <w:sz w:val="22"/>
           <w:szCs w:val="20"/>
         </w:rPr>
-        <w:t>encough</w:t>
+        <w:t>sth</w:t>
       </w:r>
       <w:proofErr w:type="spellEnd"/>
       <w:r>
@@ -1333,24 +1423,6 @@
           <w:sz w:val="22"/>
           <w:szCs w:val="20"/>
         </w:rPr>
-        <w:t xml:space="preserve"> for sb/</w:t>
-      </w:r>
-      <w:proofErr w:type="spellStart"/>
-      <w:r>
-        <w:rPr>
-          <w:rFonts w:ascii="Times New Roman" w:hAnsi="Times New Roman" w:cs="Times New Roman" w:hint="eastAsia"/>
-          <w:sz w:val="22"/>
-          <w:szCs w:val="20"/>
-        </w:rPr>
-        <w:t>sth</w:t>
-      </w:r>
-      <w:proofErr w:type="spellEnd"/>
-      <w:r>
-        <w:rPr>
-          <w:rFonts w:ascii="Times New Roman" w:hAnsi="Times New Roman" w:cs="Times New Roman" w:hint="eastAsia"/>
-          <w:sz w:val="22"/>
-          <w:szCs w:val="20"/>
-        </w:rPr>
         <w:t>.</w:t>
       </w:r>
     </w:p>
@@ -1476,7 +1548,7 @@
           <w:sz w:val="22"/>
           <w:szCs w:val="20"/>
         </w:rPr>
-        <w:t>/  (AW: Academic Words)</w:t>
+        <w:t>/ (AW: Academic Words)</w:t>
       </w:r>
       <w:r>
         <w:rPr>
@@ -1653,39 +1725,129 @@
       <w:r>
         <w:rPr>
           <w:rFonts w:ascii="Times New Roman" w:hAnsi="Times New Roman" w:cs="Times New Roman" w:hint="eastAsia"/>
+          <w:b/>
+          <w:bCs/>
           <w:sz w:val="22"/>
           <w:szCs w:val="20"/>
         </w:rPr>
         <w:t>cumulative</w:t>
       </w:r>
-    </w:p>
-    <w:p>
-      <w:pPr>
-        <w:jc w:val="left"/>
-        <w:rPr>
-          <w:rFonts w:ascii="Times New Roman" w:hAnsi="Times New Roman" w:cs="Times New Roman"/>
-          <w:sz w:val="22"/>
-          <w:szCs w:val="20"/>
-        </w:rPr>
-      </w:pPr>
-    </w:p>
-    <w:p>
-      <w:pPr>
-        <w:jc w:val="left"/>
-        <w:rPr>
-          <w:rFonts w:ascii="Times New Roman" w:hAnsi="Times New Roman" w:cs="Times New Roman"/>
-          <w:sz w:val="22"/>
-          <w:szCs w:val="20"/>
-        </w:rPr>
-      </w:pPr>
-      <w:r>
-        <w:rPr>
-          <w:rFonts w:ascii="Times New Roman" w:hAnsi="Times New Roman" w:cs="Times New Roman" w:hint="eastAsia"/>
+      <w:r>
+        <w:rPr>
+          <w:rFonts w:ascii="Times New Roman" w:hAnsi="Times New Roman" w:cs="Times New Roman"/>
+          <w:sz w:val="22"/>
+          <w:szCs w:val="20"/>
+        </w:rPr>
+        <w:br/>
+      </w:r>
+      <w:r>
+        <w:rPr>
+          <w:rFonts w:ascii="Times New Roman" w:hAnsi="Times New Roman" w:cs="Times New Roman" w:hint="eastAsia"/>
+          <w:sz w:val="22"/>
+          <w:szCs w:val="20"/>
+        </w:rPr>
+        <w:t xml:space="preserve">[adj.] having a result that increases importance or strength each time more of </w:t>
+      </w:r>
+      <w:proofErr w:type="spellStart"/>
+      <w:r>
+        <w:rPr>
+          <w:rFonts w:ascii="Times New Roman" w:hAnsi="Times New Roman" w:cs="Times New Roman" w:hint="eastAsia"/>
+          <w:sz w:val="22"/>
+          <w:szCs w:val="20"/>
+        </w:rPr>
+        <w:t>sth</w:t>
+      </w:r>
+      <w:proofErr w:type="spellEnd"/>
+      <w:r>
+        <w:rPr>
+          <w:rFonts w:ascii="Times New Roman" w:hAnsi="Times New Roman" w:cs="Times New Roman" w:hint="eastAsia"/>
+          <w:sz w:val="22"/>
+          <w:szCs w:val="20"/>
+        </w:rPr>
+        <w:t xml:space="preserve"> is added.</w:t>
+      </w:r>
+    </w:p>
+    <w:p>
+      <w:pPr>
+        <w:jc w:val="left"/>
+        <w:rPr>
+          <w:rFonts w:ascii="Times New Roman" w:hAnsi="Times New Roman" w:cs="Times New Roman"/>
+          <w:sz w:val="22"/>
+          <w:szCs w:val="20"/>
+        </w:rPr>
+      </w:pPr>
+      <w:r>
+        <w:rPr>
+          <w:rFonts w:ascii="Times New Roman" w:hAnsi="Times New Roman" w:cs="Times New Roman" w:hint="eastAsia"/>
+          <w:sz w:val="22"/>
+          <w:szCs w:val="20"/>
+        </w:rPr>
+        <w:t xml:space="preserve">The evolution of human life is a gradual, cumulative process. </w:t>
+      </w:r>
+    </w:p>
+    <w:p>
+      <w:pPr>
+        <w:jc w:val="left"/>
+        <w:rPr>
+          <w:rFonts w:ascii="Times New Roman" w:hAnsi="Times New Roman" w:cs="Times New Roman"/>
+          <w:sz w:val="22"/>
+          <w:szCs w:val="20"/>
+        </w:rPr>
+      </w:pPr>
+    </w:p>
+    <w:p>
+      <w:pPr>
+        <w:jc w:val="left"/>
+        <w:rPr>
+          <w:rFonts w:ascii="Times New Roman" w:hAnsi="Times New Roman" w:cs="Times New Roman"/>
+          <w:sz w:val="22"/>
+          <w:szCs w:val="20"/>
+        </w:rPr>
+      </w:pPr>
+      <w:r>
+        <w:rPr>
+          <w:rFonts w:ascii="Times New Roman" w:hAnsi="Times New Roman" w:cs="Times New Roman" w:hint="eastAsia"/>
+          <w:b/>
+          <w:bCs/>
           <w:sz w:val="22"/>
           <w:szCs w:val="20"/>
         </w:rPr>
         <w:t>pernicious</w:t>
       </w:r>
+      <w:r>
+        <w:rPr>
+          <w:rFonts w:ascii="Times New Roman" w:hAnsi="Times New Roman" w:cs="Times New Roman"/>
+          <w:sz w:val="22"/>
+          <w:szCs w:val="20"/>
+        </w:rPr>
+        <w:br/>
+      </w:r>
+      <w:r>
+        <w:rPr>
+          <w:rFonts w:ascii="Times New Roman" w:hAnsi="Times New Roman" w:cs="Times New Roman" w:hint="eastAsia"/>
+          <w:sz w:val="22"/>
+          <w:szCs w:val="20"/>
+        </w:rPr>
+        <w:t>[adj.] having a very harmful effect on sb/</w:t>
+      </w:r>
+      <w:proofErr w:type="spellStart"/>
+      <w:r>
+        <w:rPr>
+          <w:rFonts w:ascii="Times New Roman" w:hAnsi="Times New Roman" w:cs="Times New Roman" w:hint="eastAsia"/>
+          <w:sz w:val="22"/>
+          <w:szCs w:val="20"/>
+        </w:rPr>
+        <w:t>sth</w:t>
+      </w:r>
+      <w:proofErr w:type="spellEnd"/>
+      <w:r>
+        <w:rPr>
+          <w:rFonts w:ascii="Times New Roman" w:hAnsi="Times New Roman" w:cs="Times New Roman" w:hint="eastAsia"/>
+          <w:sz w:val="22"/>
+          <w:szCs w:val="20"/>
+        </w:rPr>
+        <w:t>, especially in way that is gradual and not easily noticed</w:t>
+      </w:r>
     </w:p>
     <w:p>
       <w:pPr>
@@ -1722,7 +1884,7 @@
           <w:sz w:val="22"/>
           <w:szCs w:val="20"/>
         </w:rPr>
-        <w:t xml:space="preserve">  </w:t>
+        <w:t xml:space="preserve"> </w:t>
       </w:r>
       <w:r>
         <w:rPr>
@@ -1827,7 +1989,23 @@
           <w:sz w:val="22"/>
           <w:szCs w:val="20"/>
         </w:rPr>
-        <w:t>[</w:t>
+        <w:t>[n.</w:t>
+      </w:r>
+      <w:r>
+        <w:rPr>
+          <w:rFonts w:ascii="Times New Roman" w:hAnsi="Times New Roman" w:cs="Times New Roman" w:hint="eastAsia"/>
+          <w:sz w:val="22"/>
+          <w:szCs w:val="20"/>
+        </w:rPr>
+        <w:t xml:space="preserve"> </w:t>
+      </w:r>
+      <w:r>
+        <w:rPr>
+          <w:rFonts w:ascii="Times New Roman" w:hAnsi="Times New Roman" w:cs="Times New Roman" w:hint="eastAsia"/>
+          <w:sz w:val="22"/>
+          <w:szCs w:val="20"/>
+        </w:rPr>
+        <w:t xml:space="preserve">U.] the act of combining separate ideas, beliefs, styles, </w:t>
       </w:r>
       <w:proofErr w:type="spellStart"/>
       <w:r>
@@ -1836,7 +2014,7 @@
           <w:sz w:val="22"/>
           <w:szCs w:val="20"/>
         </w:rPr>
-        <w:t>n.U</w:t>
+        <w:t>etc</w:t>
       </w:r>
       <w:proofErr w:type="spellEnd"/>
       <w:r>
@@ -1845,24 +2023,6 @@
           <w:sz w:val="22"/>
           <w:szCs w:val="20"/>
         </w:rPr>
-        <w:t xml:space="preserve">.] the act of combining separate ideas, beliefs, styles, </w:t>
-      </w:r>
-      <w:proofErr w:type="spellStart"/>
-      <w:r>
-        <w:rPr>
-          <w:rFonts w:ascii="Times New Roman" w:hAnsi="Times New Roman" w:cs="Times New Roman" w:hint="eastAsia"/>
-          <w:sz w:val="22"/>
-          <w:szCs w:val="20"/>
-        </w:rPr>
-        <w:t>etc</w:t>
-      </w:r>
-      <w:proofErr w:type="spellEnd"/>
-      <w:r>
-        <w:rPr>
-          <w:rFonts w:ascii="Times New Roman" w:hAnsi="Times New Roman" w:cs="Times New Roman" w:hint="eastAsia"/>
-          <w:sz w:val="22"/>
-          <w:szCs w:val="20"/>
-        </w:rPr>
         <w:t xml:space="preserve">; a mixture or combination of ideas, beliefs, styles, etc. </w:t>
       </w:r>
     </w:p>
@@ -1898,7 +2058,7 @@
       <w:pPr>
         <w:jc w:val="left"/>
         <w:rPr>
-          <w:rFonts w:ascii="Times New Roman" w:hAnsi="Times New Roman" w:cs="Times New Roman" w:hint="eastAsia"/>
+          <w:rFonts w:ascii="Times New Roman" w:hAnsi="Times New Roman" w:cs="Times New Roman"/>
           <w:sz w:val="22"/>
           <w:szCs w:val="20"/>
         </w:rPr>
@@ -1955,13 +2115,167 @@
         </w:rPr>
         <w:t xml:space="preserve">the subtleties of language. </w:t>
       </w:r>
-      <w:r>
-        <w:rPr>
-          <w:rFonts w:ascii="Times New Roman" w:hAnsi="Times New Roman" w:cs="Times New Roman"/>
+    </w:p>
+    <w:p>
+      <w:pPr>
+        <w:jc w:val="left"/>
+        <w:rPr>
+          <w:rFonts w:ascii="Times New Roman" w:hAnsi="Times New Roman" w:cs="Times New Roman"/>
+          <w:sz w:val="22"/>
+          <w:szCs w:val="20"/>
+        </w:rPr>
+      </w:pPr>
+    </w:p>
+    <w:p>
+      <w:pPr>
+        <w:jc w:val="left"/>
+        <w:rPr>
+          <w:rFonts w:ascii="Times New Roman" w:hAnsi="Times New Roman" w:cs="Times New Roman"/>
+          <w:sz w:val="22"/>
+          <w:szCs w:val="20"/>
+        </w:rPr>
+      </w:pPr>
+      <w:r>
+        <w:rPr>
+          <w:rFonts w:ascii="Times New Roman" w:hAnsi="Times New Roman" w:cs="Times New Roman" w:hint="eastAsia"/>
+          <w:b/>
+          <w:bCs/>
+          <w:sz w:val="22"/>
+          <w:szCs w:val="20"/>
+        </w:rPr>
+        <w:t>meticulous</w:t>
+      </w:r>
+      <w:r>
+        <w:rPr>
+          <w:rFonts w:ascii="Times New Roman" w:hAnsi="Times New Roman" w:cs="Times New Roman"/>
+          <w:b/>
+          <w:bCs/>
           <w:sz w:val="22"/>
           <w:szCs w:val="20"/>
         </w:rPr>
         <w:br/>
+      </w:r>
+      <w:r>
+        <w:rPr>
+          <w:rFonts w:ascii="Times New Roman" w:hAnsi="Times New Roman" w:cs="Times New Roman" w:hint="eastAsia"/>
+          <w:sz w:val="22"/>
+          <w:szCs w:val="20"/>
+        </w:rPr>
+        <w:t>[adj.] paying careful attention to every detail</w:t>
+      </w:r>
+    </w:p>
+    <w:p>
+      <w:pPr>
+        <w:jc w:val="left"/>
+        <w:rPr>
+          <w:rFonts w:ascii="Times New Roman" w:hAnsi="Times New Roman" w:cs="Times New Roman"/>
+          <w:sz w:val="22"/>
+          <w:szCs w:val="20"/>
+        </w:rPr>
+      </w:pPr>
+    </w:p>
+    <w:p>
+      <w:pPr>
+        <w:jc w:val="left"/>
+        <w:rPr>
+          <w:rFonts w:ascii="Times New Roman" w:hAnsi="Times New Roman" w:cs="Times New Roman"/>
+          <w:sz w:val="22"/>
+          <w:szCs w:val="20"/>
+        </w:rPr>
+      </w:pPr>
+      <w:r>
+        <w:rPr>
+          <w:rFonts w:ascii="Times New Roman" w:hAnsi="Times New Roman" w:cs="Times New Roman" w:hint="eastAsia"/>
+          <w:b/>
+          <w:bCs/>
+          <w:sz w:val="22"/>
+          <w:szCs w:val="20"/>
+        </w:rPr>
+        <w:t>reciprocal</w:t>
+      </w:r>
+      <w:r>
+        <w:rPr>
+          <w:rFonts w:ascii="Times New Roman" w:hAnsi="Times New Roman" w:cs="Times New Roman"/>
+          <w:sz w:val="22"/>
+          <w:szCs w:val="20"/>
+        </w:rPr>
+        <w:br/>
+      </w:r>
+      <w:r>
+        <w:rPr>
+          <w:rFonts w:ascii="Times New Roman" w:hAnsi="Times New Roman" w:cs="Times New Roman" w:hint="eastAsia"/>
+          <w:sz w:val="22"/>
+          <w:szCs w:val="20"/>
+        </w:rPr>
+        <w:t xml:space="preserve">[adj.] involving two people or groups who agree to help each other or behave in the same way to each other. </w:t>
+      </w:r>
+    </w:p>
+    <w:p>
+      <w:pPr>
+        <w:jc w:val="left"/>
+        <w:rPr>
+          <w:rFonts w:ascii="Times New Roman" w:hAnsi="Times New Roman" w:cs="Times New Roman"/>
+          <w:sz w:val="22"/>
+          <w:szCs w:val="20"/>
+        </w:rPr>
+      </w:pPr>
+    </w:p>
+    <w:p>
+      <w:pPr>
+        <w:jc w:val="left"/>
+        <w:rPr>
+          <w:rFonts w:ascii="Times New Roman" w:hAnsi="Times New Roman" w:cs="Times New Roman"/>
+          <w:b/>
+          <w:bCs/>
+          <w:sz w:val="22"/>
+          <w:szCs w:val="20"/>
+        </w:rPr>
+      </w:pPr>
+      <w:r>
+        <w:rPr>
+          <w:rFonts w:ascii="Times New Roman" w:hAnsi="Times New Roman" w:cs="Times New Roman" w:hint="eastAsia"/>
+          <w:b/>
+          <w:bCs/>
+          <w:sz w:val="22"/>
+          <w:szCs w:val="20"/>
+        </w:rPr>
+        <w:t>assembler</w:t>
+      </w:r>
+    </w:p>
+    <w:p>
+      <w:pPr>
+        <w:jc w:val="left"/>
+        <w:rPr>
+          <w:rFonts w:ascii="Times New Roman" w:hAnsi="Times New Roman" w:cs="Times New Roman"/>
+          <w:sz w:val="22"/>
+          <w:szCs w:val="20"/>
+        </w:rPr>
+      </w:pPr>
+      <w:r>
+        <w:rPr>
+          <w:rFonts w:ascii="Times New Roman" w:hAnsi="Times New Roman" w:cs="Times New Roman" w:hint="eastAsia"/>
+          <w:sz w:val="22"/>
+          <w:szCs w:val="20"/>
+        </w:rPr>
+        <w:t>1. a program for changing instructions into machine code</w:t>
+      </w:r>
+    </w:p>
+    <w:p>
+      <w:pPr>
+        <w:jc w:val="left"/>
+        <w:rPr>
+          <w:rFonts w:ascii="Times New Roman" w:hAnsi="Times New Roman" w:cs="Times New Roman" w:hint="eastAsia"/>
+          <w:sz w:val="22"/>
+          <w:szCs w:val="20"/>
+        </w:rPr>
+      </w:pPr>
+      <w:r>
+        <w:rPr>
+          <w:rFonts w:ascii="Times New Roman" w:hAnsi="Times New Roman" w:cs="Times New Roman" w:hint="eastAsia"/>
+          <w:sz w:val="22"/>
+          <w:szCs w:val="20"/>
+        </w:rPr>
+        <w:t xml:space="preserve">2. = assembly language </w:t>
       </w:r>
     </w:p>
     <w:sectPr>

</xml_diff>